<commit_message>
Revamp CV: condense experience, merge duplicate roles, update bio
- Add Siemens Energy (Data & AI) and rewrite entries to concise dated lines
- Merge duplicate SOLHEA and Wolters Kluwer roles into single entries
- Merge Free University PhD + MSc into one Education entry
- Rewrite intro bio; drop Languages and Other-skills sections
- Regenerate Evgeny_Tomsen_CV.docx from updated content
- Remove unused images gecolab.png, sonetico.png

Co-Authored-By: Claude Opus 4.8 (1M context) <noreply@anthropic.com>
</commit_message>
<xml_diff>
--- a/Evgeny_Tomsen_CV.docx
+++ b/Evgeny_Tomsen_CV.docx
@@ -4,2425 +4,1481 @@
   <w:body>
     <w:p>
       <w:pPr>
-        <w:spacing w:after="80"/>
+        <w:spacing w:before="0" w:after="40"/>
       </w:pPr>
       <w:r>
         <w:rPr>
           <w:b/>
+          <w:i w:val="0"/>
           <w:color w:val="2C3F51"/>
-          <w:sz w:val="56"/>
+          <w:sz w:val="44"/>
         </w:rPr>
         <w:t>Evgeny Tomsen</w:t>
       </w:r>
     </w:p>
     <w:p>
       <w:pPr>
-        <w:spacing w:after="120"/>
+        <w:spacing w:before="0" w:after="80"/>
       </w:pPr>
       <w:r>
         <w:rPr>
-          <w:color w:val="2C3F51"/>
+          <w:b/>
+          <w:i w:val="0"/>
+          <w:sz w:val="21"/>
         </w:rPr>
-        <w:t xml:space="preserve">Privet / Éila / Griesti! I'm </w:t>
+        <w:t>Lead Software Engineer</w:t>
       </w:r>
       <w:r>
         <w:rPr>
-          <w:b/>
-          <w:color w:val="2C3F51"/>
+          <w:b w:val="0"/>
+          <w:i w:val="0"/>
+          <w:sz w:val="21"/>
         </w:rPr>
-        <w:t>Evgeny Tomsen</w:t>
+        <w:t xml:space="preserve"> with 20 years in IT - turning complex problems into clean, reliable systems across financial services, healthcare, and travel tech. Former university lecturer in Computer Science, with a focus on developing engineering talent. Certified freediver who's just as comfortable solving hard problems as holding their breath under pressure. Fluent in English, Italian and Russian. For job matters, drop me an </w:t>
       </w:r>
       <w:r>
         <w:rPr>
-          <w:color w:val="2C3F51"/>
-        </w:rPr>
-        <w:t xml:space="preserve"> — JavaScript developer 💻, father of Lev 🦁 and Südtirol mountains lover 🏔. For job matters please write me an </w:t>
-      </w:r>
-      <w:r>
-        <w:rPr>
-          <w:color w:val="1980E6"/>
+          <w:b w:val="0"/>
+          <w:i w:val="0"/>
+          <w:sz w:val="21"/>
         </w:rPr>
         <w:t>email</w:t>
       </w:r>
       <w:r>
         <w:rPr>
-          <w:color w:val="2C3F51"/>
+          <w:b w:val="0"/>
+          <w:i w:val="0"/>
+          <w:sz w:val="21"/>
         </w:rPr>
-        <w:t xml:space="preserve"> (evgeny@tomsen.me), otherwise feel free to chat with me via </w:t>
+        <w:t>.</w:t>
       </w:r>
+    </w:p>
+    <w:p/>
+    <w:p>
+      <w:pPr>
+        <w:spacing w:before="0" w:after="80"/>
+      </w:pPr>
       <w:r>
         <w:rPr>
-          <w:color w:val="1980E6"/>
+          <w:b/>
+          <w:i w:val="0"/>
+          <w:color w:val="2C3F51"/>
+          <w:sz w:val="30"/>
         </w:rPr>
-        <w:t>Telegram</w:t>
-      </w:r>
-      <w:r>
-        <w:rPr>
-          <w:color w:val="2C3F51"/>
-        </w:rPr>
-        <w:t xml:space="preserve"> (t.me/daubihe). I'm fluent in English, Italian and Russian… Angular, React, Svelte, Ionic, Stencil, Node.js and some others.</w:t>
+        <w:t>Experience</w:t>
       </w:r>
     </w:p>
     <w:p>
       <w:pPr>
-        <w:pBdr>
-          <w:bottom w:val="single" w:sz="6" w:space="1" w:color="999999"/>
-        </w:pBdr>
-        <w:spacing w:after="40"/>
-      </w:pPr>
-    </w:p>
-    <w:p>
-      <w:pPr>
-        <w:spacing w:before="200" w:after="120"/>
+        <w:spacing w:before="160" w:after="20"/>
       </w:pPr>
       <w:r>
         <w:rPr>
           <w:b/>
+          <w:i w:val="0"/>
           <w:color w:val="2C3F51"/>
-          <w:sz w:val="36"/>
+          <w:sz w:val="23"/>
         </w:rPr>
-        <w:t>Experience</w:t>
+        <w:t>Data &amp; AI Engineer</w:t>
       </w:r>
-    </w:p>
-    <w:tbl>
-      <w:tblPr>
-        <w:tblW w:type="auto" w:w="0"/>
-        <w:jc w:val="center"/>
-        <w:tblLayout w:type="fixed"/>
-        <w:tblLook w:firstColumn="1" w:firstRow="1" w:lastColumn="0" w:lastRow="0" w:noHBand="0" w:noVBand="1" w:val="04A0"/>
-        <w:tblLayout w:type="fixed"/>
-      </w:tblPr>
-      <w:tblGrid>
-        <w:gridCol w:w="5112"/>
-        <w:gridCol w:w="5112"/>
-      </w:tblGrid>
-      <w:tr>
-        <w:tc>
-          <w:tcPr>
-            <w:tcW w:type="dxa" w:w="1584"/>
-            <w:vAlign w:val="top"/>
-          </w:tcPr>
-          <w:p>
-            <w:pPr>
-              <w:jc w:val="center"/>
-            </w:pPr>
-            <w:r>
-              <w:drawing>
-                <wp:inline xmlns:a="http://schemas.openxmlformats.org/drawingml/2006/main" xmlns:pic="http://schemas.openxmlformats.org/drawingml/2006/picture">
-                  <wp:extent cx="777240" cy="777240"/>
-                  <wp:docPr id="1" name="Picture 1"/>
-                  <wp:cNvGraphicFramePr>
-                    <a:graphicFrameLocks noChangeAspect="1"/>
-                  </wp:cNvGraphicFramePr>
-                  <a:graphic>
-                    <a:graphicData uri="http://schemas.openxmlformats.org/drawingml/2006/picture">
-                      <pic:pic>
-                        <pic:nvPicPr>
-                          <pic:cNvPr id="0" name="evision.png"/>
-                          <pic:cNvPicPr/>
-                        </pic:nvPicPr>
-                        <pic:blipFill>
-                          <a:blip r:embed="rId9"/>
-                          <a:stretch>
-                            <a:fillRect/>
-                          </a:stretch>
-                        </pic:blipFill>
-                        <pic:spPr>
-                          <a:xfrm>
-                            <a:off x="0" y="0"/>
-                            <a:ext cx="777240" cy="777240"/>
-                          </a:xfrm>
-                          <a:prstGeom prst="rect"/>
-                        </pic:spPr>
-                      </pic:pic>
-                    </a:graphicData>
-                  </a:graphic>
-                </wp:inline>
-              </w:drawing>
-            </w:r>
-          </w:p>
-        </w:tc>
-        <w:tc>
-          <w:tcPr>
-            <w:tcW w:type="dxa" w:w="8640"/>
-            <w:tcBorders>
-              <w:left w:val="dashed" w:sz="8" w:space="0" w:color="2c3f51"/>
-            </w:tcBorders>
-            <w:vAlign w:val="top"/>
-          </w:tcPr>
-          <w:p>
-            <w:pPr>
-              <w:spacing w:after="0"/>
-              <w:jc w:val="left"/>
-            </w:pPr>
-            <w:r>
-              <w:rPr>
-                <w:b/>
-                <w:color w:val="2C3F51"/>
-                <w:sz w:val="26"/>
-              </w:rPr>
-              <w:t>Senior Frontend Developer</w:t>
-            </w:r>
-          </w:p>
-          <w:p>
-            <w:pPr>
-              <w:spacing w:after="0"/>
-              <w:jc w:val="left"/>
-            </w:pPr>
-            <w:r>
-              <w:rPr>
-                <w:color w:val="1980E6"/>
-              </w:rPr>
-              <w:t xml:space="preserve">eVision Software / Enablon / </w:t>
-            </w:r>
-            <w:r>
-              <w:rPr>
-                <w:b/>
-                <w:color w:val="1980E6"/>
-              </w:rPr>
-              <w:t>Wolters Kluwer</w:t>
-            </w:r>
-          </w:p>
-          <w:p>
-            <w:pPr>
-              <w:spacing w:after="80"/>
-              <w:jc w:val="left"/>
-            </w:pPr>
-            <w:r>
-              <w:rPr>
-                <w:i/>
-                <w:color w:val="666666"/>
-                <w:sz w:val="18"/>
-              </w:rPr>
-              <w:t>January 2021 – Now · The Hague (remotely via iTransition and Solhea)</w:t>
-            </w:r>
-          </w:p>
-          <w:p>
-            <w:pPr>
-              <w:spacing w:after="40"/>
-              <w:jc w:val="left"/>
-            </w:pPr>
-            <w:r>
-              <w:rPr>
-                <w:color w:val="2C3F51"/>
-              </w:rPr>
-              <w:t xml:space="preserve">After a year and a half break I was generously invited to reinforce the eVision team again, working in </w:t>
-            </w:r>
-            <w:r>
-              <w:rPr>
-                <w:b/>
-                <w:color w:val="2C3F51"/>
-              </w:rPr>
-              <w:t>React</w:t>
-            </w:r>
-            <w:r>
-              <w:rPr>
-                <w:color w:val="2C3F51"/>
-              </w:rPr>
-              <w:t xml:space="preserve"> on new features of PermitVision and improving its PWA support.</w:t>
-            </w:r>
-          </w:p>
-        </w:tc>
-      </w:tr>
-    </w:tbl>
-    <w:p>
-      <w:pPr>
-        <w:spacing w:after="40" w:line="144" w:lineRule="auto"/>
-      </w:pPr>
-    </w:p>
-    <w:tbl>
-      <w:tblPr>
-        <w:tblW w:type="auto" w:w="0"/>
-        <w:jc w:val="center"/>
-        <w:tblLayout w:type="fixed"/>
-        <w:tblLook w:firstColumn="1" w:firstRow="1" w:lastColumn="0" w:lastRow="0" w:noHBand="0" w:noVBand="1" w:val="04A0"/>
-        <w:tblLayout w:type="fixed"/>
-      </w:tblPr>
-      <w:tblGrid>
-        <w:gridCol w:w="5112"/>
-        <w:gridCol w:w="5112"/>
-      </w:tblGrid>
-      <w:tr>
-        <w:tc>
-          <w:tcPr>
-            <w:tcW w:type="dxa" w:w="8640"/>
-            <w:tcBorders>
-              <w:right w:val="dashed" w:sz="8" w:space="0" w:color="2c3f51"/>
-            </w:tcBorders>
-            <w:vAlign w:val="top"/>
-          </w:tcPr>
-          <w:p>
-            <w:pPr>
-              <w:spacing w:after="0"/>
-              <w:jc w:val="right"/>
-            </w:pPr>
-            <w:r>
-              <w:rPr>
-                <w:b/>
-                <w:color w:val="2C3F51"/>
-                <w:sz w:val="26"/>
-              </w:rPr>
-              <w:t>Frontend Tech Lead</w:t>
-            </w:r>
-          </w:p>
-          <w:p>
-            <w:pPr>
-              <w:spacing w:after="0"/>
-              <w:jc w:val="right"/>
-            </w:pPr>
-            <w:r>
-              <w:rPr>
-                <w:color w:val="1980E6"/>
-              </w:rPr>
-              <w:t>SOLHEA Srl</w:t>
-            </w:r>
-          </w:p>
-          <w:p>
-            <w:pPr>
-              <w:spacing w:after="80"/>
-              <w:jc w:val="right"/>
-            </w:pPr>
-            <w:r>
-              <w:rPr>
-                <w:i/>
-                <w:color w:val="666666"/>
-                <w:sz w:val="18"/>
-              </w:rPr>
-              <w:t>April 2020 – Now · Bolzano, Italy</w:t>
-            </w:r>
-          </w:p>
-          <w:p>
-            <w:pPr>
-              <w:spacing w:after="40"/>
-              <w:jc w:val="right"/>
-            </w:pPr>
-            <w:r>
-              <w:rPr>
-                <w:color w:val="2C3F51"/>
-              </w:rPr>
-              <w:t>As part of a collaboration with Solhea started in 2013, we've developed several web systems and mobile apps in the field of therapy/clinical risk management and work-security event management. My tasks were to architect the frontend for web/mobile apps and design the (mainly serverless GCP) backend and data storage. I also acted as team lead for external developers, helping with merge-request review, knowledge sharing and onboarding. As a main achievement, I handled the monorepo migration for several projects consisting of web, mobile and backend parts — improving code quality through shared common parts and streamlining project review and delivery.</w:t>
-            </w:r>
-          </w:p>
-        </w:tc>
-        <w:tc>
-          <w:tcPr>
-            <w:tcW w:type="dxa" w:w="1584"/>
-            <w:vAlign w:val="top"/>
-          </w:tcPr>
-          <w:p>
-            <w:pPr>
-              <w:jc w:val="center"/>
-            </w:pPr>
-            <w:r>
-              <w:drawing>
-                <wp:inline xmlns:a="http://schemas.openxmlformats.org/drawingml/2006/main" xmlns:pic="http://schemas.openxmlformats.org/drawingml/2006/picture">
-                  <wp:extent cx="777240" cy="777240"/>
-                  <wp:docPr id="2" name="Picture 2"/>
-                  <wp:cNvGraphicFramePr>
-                    <a:graphicFrameLocks noChangeAspect="1"/>
-                  </wp:cNvGraphicFramePr>
-                  <a:graphic>
-                    <a:graphicData uri="http://schemas.openxmlformats.org/drawingml/2006/picture">
-                      <pic:pic>
-                        <pic:nvPicPr>
-                          <pic:cNvPr id="0" name="solhea.png"/>
-                          <pic:cNvPicPr/>
-                        </pic:nvPicPr>
-                        <pic:blipFill>
-                          <a:blip r:embed="rId10"/>
-                          <a:stretch>
-                            <a:fillRect/>
-                          </a:stretch>
-                        </pic:blipFill>
-                        <pic:spPr>
-                          <a:xfrm>
-                            <a:off x="0" y="0"/>
-                            <a:ext cx="777240" cy="777240"/>
-                          </a:xfrm>
-                          <a:prstGeom prst="rect"/>
-                        </pic:spPr>
-                      </pic:pic>
-                    </a:graphicData>
-                  </a:graphic>
-                </wp:inline>
-              </w:drawing>
-            </w:r>
-          </w:p>
-        </w:tc>
-      </w:tr>
-    </w:tbl>
-    <w:p>
-      <w:pPr>
-        <w:spacing w:after="40" w:line="144" w:lineRule="auto"/>
-      </w:pPr>
-    </w:p>
-    <w:tbl>
-      <w:tblPr>
-        <w:tblW w:type="auto" w:w="0"/>
-        <w:jc w:val="center"/>
-        <w:tblLayout w:type="fixed"/>
-        <w:tblLook w:firstColumn="1" w:firstRow="1" w:lastColumn="0" w:lastRow="0" w:noHBand="0" w:noVBand="1" w:val="04A0"/>
-        <w:tblLayout w:type="fixed"/>
-      </w:tblPr>
-      <w:tblGrid>
-        <w:gridCol w:w="5112"/>
-        <w:gridCol w:w="5112"/>
-      </w:tblGrid>
-      <w:tr>
-        <w:tc>
-          <w:tcPr>
-            <w:tcW w:type="dxa" w:w="1584"/>
-            <w:vAlign w:val="top"/>
-          </w:tcPr>
-          <w:p>
-            <w:pPr>
-              <w:jc w:val="center"/>
-            </w:pPr>
-            <w:r>
-              <w:drawing>
-                <wp:inline xmlns:a="http://schemas.openxmlformats.org/drawingml/2006/main" xmlns:pic="http://schemas.openxmlformats.org/drawingml/2006/picture">
-                  <wp:extent cx="777240" cy="777240"/>
-                  <wp:docPr id="3" name="Picture 3"/>
-                  <wp:cNvGraphicFramePr>
-                    <a:graphicFrameLocks noChangeAspect="1"/>
-                  </wp:cNvGraphicFramePr>
-                  <a:graphic>
-                    <a:graphicData uri="http://schemas.openxmlformats.org/drawingml/2006/picture">
-                      <pic:pic>
-                        <pic:nvPicPr>
-                          <pic:cNvPr id="0" name="brightcape.png"/>
-                          <pic:cNvPicPr/>
-                        </pic:nvPicPr>
-                        <pic:blipFill>
-                          <a:blip r:embed="rId11"/>
-                          <a:stretch>
-                            <a:fillRect/>
-                          </a:stretch>
-                        </pic:blipFill>
-                        <pic:spPr>
-                          <a:xfrm>
-                            <a:off x="0" y="0"/>
-                            <a:ext cx="777240" cy="777240"/>
-                          </a:xfrm>
-                          <a:prstGeom prst="rect"/>
-                        </pic:spPr>
-                      </pic:pic>
-                    </a:graphicData>
-                  </a:graphic>
-                </wp:inline>
-              </w:drawing>
-            </w:r>
-          </w:p>
-        </w:tc>
-        <w:tc>
-          <w:tcPr>
-            <w:tcW w:type="dxa" w:w="8640"/>
-            <w:tcBorders>
-              <w:left w:val="dashed" w:sz="8" w:space="0" w:color="2c3f51"/>
-            </w:tcBorders>
-            <w:vAlign w:val="top"/>
-          </w:tcPr>
-          <w:p>
-            <w:pPr>
-              <w:spacing w:after="0"/>
-              <w:jc w:val="left"/>
-            </w:pPr>
-            <w:r>
-              <w:rPr>
-                <w:b/>
-                <w:color w:val="2C3F51"/>
-                <w:sz w:val="26"/>
-              </w:rPr>
-              <w:t>Frontend Tech Lead</w:t>
-            </w:r>
-          </w:p>
-          <w:p>
-            <w:pPr>
-              <w:spacing w:after="0"/>
-              <w:jc w:val="left"/>
-            </w:pPr>
-            <w:r>
-              <w:rPr>
-                <w:b/>
-                <w:color w:val="2C3F51"/>
-              </w:rPr>
-              <w:t>BrightCape</w:t>
-            </w:r>
-          </w:p>
-          <w:p>
-            <w:pPr>
-              <w:spacing w:after="80"/>
-              <w:jc w:val="left"/>
-            </w:pPr>
-            <w:r>
-              <w:rPr>
-                <w:i/>
-                <w:color w:val="666666"/>
-                <w:sz w:val="18"/>
-              </w:rPr>
-              <w:t>September 2019 – April 2020 · Eindhoven, Netherlands</w:t>
-            </w:r>
-          </w:p>
-          <w:p>
-            <w:pPr>
-              <w:spacing w:after="40"/>
-              <w:jc w:val="left"/>
-            </w:pPr>
-            <w:r>
-              <w:rPr>
-                <w:color w:val="2C3F51"/>
-              </w:rPr>
-              <w:t xml:space="preserve">I joined BrightCape as a front-end lead to adjust the development process for an ongoing project and improve the architecture. With a small team we worked in the </w:t>
-            </w:r>
-            <w:r>
-              <w:rPr>
-                <w:b/>
-                <w:color w:val="2C3F51"/>
-              </w:rPr>
-              <w:t>Angular</w:t>
-            </w:r>
-            <w:r>
-              <w:rPr>
-                <w:color w:val="2C3F51"/>
-              </w:rPr>
-              <w:t xml:space="preserve"> stack, refactoring the management system for the SARA Robotics Health Assistant and creating the hybrid application for the robot itself. My key responsibilities were maintaining source quality and performing knowledge transfer. Within half a year we structured the project, created a custom </w:t>
-            </w:r>
-            <w:r>
-              <w:rPr>
-                <w:b/>
-                <w:color w:val="2C3F51"/>
-              </w:rPr>
-              <w:t>design system</w:t>
-            </w:r>
-            <w:r>
-              <w:rPr>
-                <w:color w:val="2C3F51"/>
-              </w:rPr>
-              <w:t xml:space="preserve"> and halved the original bundle size.</w:t>
-            </w:r>
-          </w:p>
-        </w:tc>
-      </w:tr>
-    </w:tbl>
-    <w:p>
-      <w:pPr>
-        <w:spacing w:after="40" w:line="144" w:lineRule="auto"/>
-      </w:pPr>
-    </w:p>
-    <w:tbl>
-      <w:tblPr>
-        <w:tblW w:type="auto" w:w="0"/>
-        <w:jc w:val="center"/>
-        <w:tblLayout w:type="fixed"/>
-        <w:tblLook w:firstColumn="1" w:firstRow="1" w:lastColumn="0" w:lastRow="0" w:noHBand="0" w:noVBand="1" w:val="04A0"/>
-        <w:tblLayout w:type="fixed"/>
-      </w:tblPr>
-      <w:tblGrid>
-        <w:gridCol w:w="5112"/>
-        <w:gridCol w:w="5112"/>
-      </w:tblGrid>
-      <w:tr>
-        <w:tc>
-          <w:tcPr>
-            <w:tcW w:type="dxa" w:w="8640"/>
-            <w:tcBorders>
-              <w:right w:val="dashed" w:sz="8" w:space="0" w:color="2c3f51"/>
-            </w:tcBorders>
-            <w:vAlign w:val="top"/>
-          </w:tcPr>
-          <w:p>
-            <w:pPr>
-              <w:spacing w:after="0"/>
-              <w:jc w:val="right"/>
-            </w:pPr>
-            <w:r>
-              <w:rPr>
-                <w:b/>
-                <w:color w:val="2C3F51"/>
-                <w:sz w:val="26"/>
-              </w:rPr>
-              <w:t>Senior Frontend Developer</w:t>
-            </w:r>
-          </w:p>
-          <w:p>
-            <w:pPr>
-              <w:spacing w:after="0"/>
-              <w:jc w:val="right"/>
-            </w:pPr>
-            <w:r>
-              <w:rPr>
-                <w:color w:val="1980E6"/>
-              </w:rPr>
-              <w:t xml:space="preserve">eVision Software / Enablon / </w:t>
-            </w:r>
-            <w:r>
-              <w:rPr>
-                <w:b/>
-                <w:color w:val="1980E6"/>
-              </w:rPr>
-              <w:t>Wolters Kluwer</w:t>
-            </w:r>
-          </w:p>
-          <w:p>
-            <w:pPr>
-              <w:spacing w:after="80"/>
-              <w:jc w:val="right"/>
-            </w:pPr>
-            <w:r>
-              <w:rPr>
-                <w:i/>
-                <w:color w:val="666666"/>
-                <w:sz w:val="18"/>
-              </w:rPr>
-              <w:t>April 2019 – September 2019 · The Hague, Netherlands</w:t>
-            </w:r>
-          </w:p>
-          <w:p>
-            <w:pPr>
-              <w:spacing w:after="40"/>
-              <w:jc w:val="right"/>
-            </w:pPr>
-            <w:r>
-              <w:rPr>
-                <w:color w:val="2C3F51"/>
-              </w:rPr>
-              <w:t xml:space="preserve">My first half-year in The Hague working on eVision PermitVision permit-to-work and risk-assessment software was not an easy path, but it gave me the chance to work deeply with the </w:t>
-            </w:r>
-            <w:r>
-              <w:rPr>
-                <w:b/>
-                <w:color w:val="2C3F51"/>
-              </w:rPr>
-              <w:t>React</w:t>
-            </w:r>
-            <w:r>
-              <w:rPr>
-                <w:color w:val="2C3F51"/>
-              </w:rPr>
-              <w:t xml:space="preserve"> stack at enterprise scale, coordinating between numerous teams with drastically different knowledge. I initiated the move to TypeScript and set up the migration flow for a monolith app.</w:t>
-            </w:r>
-          </w:p>
-        </w:tc>
-        <w:tc>
-          <w:tcPr>
-            <w:tcW w:type="dxa" w:w="1584"/>
-            <w:vAlign w:val="top"/>
-          </w:tcPr>
-          <w:p>
-            <w:pPr>
-              <w:jc w:val="center"/>
-            </w:pPr>
-            <w:r>
-              <w:drawing>
-                <wp:inline xmlns:a="http://schemas.openxmlformats.org/drawingml/2006/main" xmlns:pic="http://schemas.openxmlformats.org/drawingml/2006/picture">
-                  <wp:extent cx="777240" cy="777240"/>
-                  <wp:docPr id="4" name="Picture 4"/>
-                  <wp:cNvGraphicFramePr>
-                    <a:graphicFrameLocks noChangeAspect="1"/>
-                  </wp:cNvGraphicFramePr>
-                  <a:graphic>
-                    <a:graphicData uri="http://schemas.openxmlformats.org/drawingml/2006/picture">
-                      <pic:pic>
-                        <pic:nvPicPr>
-                          <pic:cNvPr id="0" name="evision.png"/>
-                          <pic:cNvPicPr/>
-                        </pic:nvPicPr>
-                        <pic:blipFill>
-                          <a:blip r:embed="rId9"/>
-                          <a:stretch>
-                            <a:fillRect/>
-                          </a:stretch>
-                        </pic:blipFill>
-                        <pic:spPr>
-                          <a:xfrm>
-                            <a:off x="0" y="0"/>
-                            <a:ext cx="777240" cy="777240"/>
-                          </a:xfrm>
-                          <a:prstGeom prst="rect"/>
-                        </pic:spPr>
-                      </pic:pic>
-                    </a:graphicData>
-                  </a:graphic>
-                </wp:inline>
-              </w:drawing>
-            </w:r>
-          </w:p>
-        </w:tc>
-      </w:tr>
-    </w:tbl>
-    <w:p>
-      <w:pPr>
-        <w:spacing w:after="40" w:line="144" w:lineRule="auto"/>
-      </w:pPr>
-    </w:p>
-    <w:tbl>
-      <w:tblPr>
-        <w:tblW w:type="auto" w:w="0"/>
-        <w:jc w:val="center"/>
-        <w:tblLayout w:type="fixed"/>
-        <w:tblLook w:firstColumn="1" w:firstRow="1" w:lastColumn="0" w:lastRow="0" w:noHBand="0" w:noVBand="1" w:val="04A0"/>
-        <w:tblLayout w:type="fixed"/>
-      </w:tblPr>
-      <w:tblGrid>
-        <w:gridCol w:w="5112"/>
-        <w:gridCol w:w="5112"/>
-      </w:tblGrid>
-      <w:tr>
-        <w:tc>
-          <w:tcPr>
-            <w:tcW w:type="dxa" w:w="1584"/>
-            <w:vAlign w:val="top"/>
-          </w:tcPr>
-          <w:p>
-            <w:pPr>
-              <w:jc w:val="center"/>
-            </w:pPr>
-            <w:r>
-              <w:drawing>
-                <wp:inline xmlns:a="http://schemas.openxmlformats.org/drawingml/2006/main" xmlns:pic="http://schemas.openxmlformats.org/drawingml/2006/picture">
-                  <wp:extent cx="777240" cy="777240"/>
-                  <wp:docPr id="5" name="Picture 5"/>
-                  <wp:cNvGraphicFramePr>
-                    <a:graphicFrameLocks noChangeAspect="1"/>
-                  </wp:cNvGraphicFramePr>
-                  <a:graphic>
-                    <a:graphicData uri="http://schemas.openxmlformats.org/drawingml/2006/picture">
-                      <pic:pic>
-                        <pic:nvPicPr>
-                          <pic:cNvPr id="0" name="klm.png"/>
-                          <pic:cNvPicPr/>
-                        </pic:nvPicPr>
-                        <pic:blipFill>
-                          <a:blip r:embed="rId12"/>
-                          <a:stretch>
-                            <a:fillRect/>
-                          </a:stretch>
-                        </pic:blipFill>
-                        <pic:spPr>
-                          <a:xfrm>
-                            <a:off x="0" y="0"/>
-                            <a:ext cx="777240" cy="777240"/>
-                          </a:xfrm>
-                          <a:prstGeom prst="rect"/>
-                        </pic:spPr>
-                      </pic:pic>
-                    </a:graphicData>
-                  </a:graphic>
-                </wp:inline>
-              </w:drawing>
-            </w:r>
-          </w:p>
-        </w:tc>
-        <w:tc>
-          <w:tcPr>
-            <w:tcW w:type="dxa" w:w="8640"/>
-            <w:tcBorders>
-              <w:left w:val="dashed" w:sz="8" w:space="0" w:color="2c3f51"/>
-            </w:tcBorders>
-            <w:vAlign w:val="top"/>
-          </w:tcPr>
-          <w:p>
-            <w:pPr>
-              <w:spacing w:after="0"/>
-              <w:jc w:val="left"/>
-            </w:pPr>
-            <w:r>
-              <w:rPr>
-                <w:b/>
-                <w:color w:val="2C3F51"/>
-                <w:sz w:val="26"/>
-              </w:rPr>
-              <w:t>Senior Fullstack Developer</w:t>
-            </w:r>
-          </w:p>
-          <w:p>
-            <w:pPr>
-              <w:spacing w:after="0"/>
-              <w:jc w:val="left"/>
-            </w:pPr>
-            <w:r>
-              <w:rPr>
-                <w:b/>
-                <w:color w:val="2C3F51"/>
-              </w:rPr>
-              <w:t>KLM Royal Dutch Airlines</w:t>
-            </w:r>
-            <w:r>
-              <w:rPr>
-                <w:color w:val="2C3F51"/>
-              </w:rPr>
-              <w:t xml:space="preserve"> (through OpenWeb IT body-bank)</w:t>
-            </w:r>
-          </w:p>
-          <w:p>
-            <w:pPr>
-              <w:spacing w:after="80"/>
-              <w:jc w:val="left"/>
-            </w:pPr>
-            <w:r>
-              <w:rPr>
-                <w:i/>
-                <w:color w:val="666666"/>
-                <w:sz w:val="18"/>
-              </w:rPr>
-              <w:t>May 2018 – April 2019 · ~1 year · Amstelveen, Netherlands</w:t>
-            </w:r>
-          </w:p>
-          <w:p>
-            <w:pPr>
-              <w:spacing w:after="40"/>
-              <w:jc w:val="left"/>
-            </w:pPr>
-            <w:r>
-              <w:rPr>
-                <w:color w:val="2C3F51"/>
-              </w:rPr>
-              <w:t xml:space="preserve">As a fullstack engineer in the KLM BlueWeb team I contributed to the development of the Royal Dutch Airlines main website — a large-scale, multi-brand web application based on </w:t>
-            </w:r>
-            <w:r>
-              <w:rPr>
-                <w:b/>
-                <w:color w:val="2C3F51"/>
-              </w:rPr>
-              <w:t>Angular, Apollo, Node.js</w:t>
-            </w:r>
-            <w:r>
-              <w:rPr>
-                <w:color w:val="2C3F51"/>
-              </w:rPr>
-              <w:t xml:space="preserve"> and </w:t>
-            </w:r>
-            <w:r>
-              <w:rPr>
-                <w:b/>
-                <w:color w:val="2C3F51"/>
-              </w:rPr>
-              <w:t>GraphQL</w:t>
-            </w:r>
-            <w:r>
-              <w:rPr>
-                <w:color w:val="2C3F51"/>
-              </w:rPr>
-              <w:t>. BlueWeb is considered one of the largest Angular implementations in the world, a reference for other projects, developed in regular contact and coordination with the Google and Apollo teams. The working profile of KLM frontend engineers includes not only pure web skills but also 'full stack' expertise, which was the most exciting part and a source of new knowledge for me personally.</w:t>
-            </w:r>
-          </w:p>
-        </w:tc>
-      </w:tr>
-    </w:tbl>
-    <w:p>
-      <w:pPr>
-        <w:spacing w:after="40" w:line="144" w:lineRule="auto"/>
-      </w:pPr>
-    </w:p>
-    <w:tbl>
-      <w:tblPr>
-        <w:tblW w:type="auto" w:w="0"/>
-        <w:jc w:val="center"/>
-        <w:tblLayout w:type="fixed"/>
-        <w:tblLook w:firstColumn="1" w:firstRow="1" w:lastColumn="0" w:lastRow="0" w:noHBand="0" w:noVBand="1" w:val="04A0"/>
-        <w:tblLayout w:type="fixed"/>
-      </w:tblPr>
-      <w:tblGrid>
-        <w:gridCol w:w="5112"/>
-        <w:gridCol w:w="5112"/>
-      </w:tblGrid>
-      <w:tr>
-        <w:tc>
-          <w:tcPr>
-            <w:tcW w:type="dxa" w:w="8640"/>
-            <w:tcBorders>
-              <w:right w:val="dashed" w:sz="8" w:space="0" w:color="2c3f51"/>
-            </w:tcBorders>
-            <w:vAlign w:val="top"/>
-          </w:tcPr>
-          <w:p>
-            <w:pPr>
-              <w:spacing w:after="0"/>
-              <w:jc w:val="right"/>
-            </w:pPr>
-            <w:r>
-              <w:rPr>
-                <w:b/>
-                <w:color w:val="2C3F51"/>
-                <w:sz w:val="26"/>
-              </w:rPr>
-              <w:t>Software Engineer</w:t>
-            </w:r>
-          </w:p>
-          <w:p>
-            <w:pPr>
-              <w:spacing w:after="0"/>
-              <w:jc w:val="right"/>
-            </w:pPr>
-            <w:r>
-              <w:rPr>
-                <w:b/>
-                <w:color w:val="2C3F51"/>
-              </w:rPr>
-              <w:t>EURAC Research</w:t>
-            </w:r>
-          </w:p>
-          <w:p>
-            <w:pPr>
-              <w:spacing w:after="80"/>
-              <w:jc w:val="right"/>
-            </w:pPr>
-            <w:r>
-              <w:rPr>
-                <w:i/>
-                <w:color w:val="666666"/>
-                <w:sz w:val="18"/>
-              </w:rPr>
-              <w:t>September 2013 – May 2017 · ~4 years · Bolzano-Bozen, Italy</w:t>
-            </w:r>
-          </w:p>
-          <w:p>
-            <w:pPr>
-              <w:spacing w:after="40"/>
-              <w:jc w:val="right"/>
-            </w:pPr>
-            <w:r>
-              <w:rPr>
-                <w:color w:val="2C3F51"/>
-              </w:rPr>
-              <w:t>I worked at the European Academy of Research — a structure uniting 12 research institutes — for almost 4 years as an IT specialist, developing and maintaining several solutions for managing internal resources and knowledge. We used a wide range of technologies:</w:t>
-            </w:r>
-          </w:p>
-          <w:p>
-            <w:pPr>
-              <w:pStyle w:val="ListBullet"/>
-              <w:spacing w:after="0"/>
-              <w:jc w:val="right"/>
-            </w:pPr>
-            <w:r>
-              <w:rPr>
-                <w:i/>
-                <w:color w:val="2C3F51"/>
-              </w:rPr>
-              <w:t>Java/Spring/Hibernate</w:t>
-            </w:r>
-            <w:r>
-              <w:rPr>
-                <w:color w:val="2C3F51"/>
-              </w:rPr>
-              <w:t xml:space="preserve"> for internal services and REST APIs.</w:t>
-            </w:r>
-          </w:p>
-          <w:p>
-            <w:pPr>
-              <w:pStyle w:val="ListBullet"/>
-              <w:spacing w:after="0"/>
-              <w:jc w:val="right"/>
-            </w:pPr>
-            <w:r>
-              <w:rPr>
-                <w:i/>
-                <w:color w:val="2C3F51"/>
-              </w:rPr>
-              <w:t>Java/Android</w:t>
-            </w:r>
-            <w:r>
-              <w:rPr>
-                <w:color w:val="2C3F51"/>
-              </w:rPr>
-              <w:t>: acted as Android developer and SCRUM master in several mobile projects — from a local news application to a mobile e-learning platform.</w:t>
-            </w:r>
-          </w:p>
-          <w:p>
-            <w:pPr>
-              <w:pStyle w:val="ListBullet"/>
-              <w:spacing w:after="0"/>
-              <w:jc w:val="right"/>
-            </w:pPr>
-            <w:r>
-              <w:rPr>
-                <w:i/>
-                <w:color w:val="2C3F51"/>
-              </w:rPr>
-              <w:t>Node.js</w:t>
-            </w:r>
-            <w:r>
-              <w:rPr>
-                <w:color w:val="2C3F51"/>
-              </w:rPr>
-              <w:t xml:space="preserve"> for a small recommendation service used within the EURAC internal web.</w:t>
-            </w:r>
-          </w:p>
-          <w:p>
-            <w:pPr>
-              <w:pStyle w:val="ListBullet"/>
-              <w:spacing w:after="0"/>
-              <w:jc w:val="right"/>
-            </w:pPr>
-            <w:r>
-              <w:rPr>
-                <w:i/>
-                <w:color w:val="2C3F51"/>
-              </w:rPr>
-              <w:t>Ionic/Angular</w:t>
-            </w:r>
-            <w:r>
-              <w:rPr>
-                <w:color w:val="2C3F51"/>
-              </w:rPr>
-              <w:t>: created a couple of mobile app prototypes using Ionic.</w:t>
-            </w:r>
-          </w:p>
-        </w:tc>
-        <w:tc>
-          <w:tcPr>
-            <w:tcW w:type="dxa" w:w="1584"/>
-            <w:vAlign w:val="top"/>
-          </w:tcPr>
-          <w:p>
-            <w:pPr>
-              <w:jc w:val="center"/>
-            </w:pPr>
-            <w:r>
-              <w:drawing>
-                <wp:inline xmlns:a="http://schemas.openxmlformats.org/drawingml/2006/main" xmlns:pic="http://schemas.openxmlformats.org/drawingml/2006/picture">
-                  <wp:extent cx="777240" cy="777240"/>
-                  <wp:docPr id="6" name="Picture 6"/>
-                  <wp:cNvGraphicFramePr>
-                    <a:graphicFrameLocks noChangeAspect="1"/>
-                  </wp:cNvGraphicFramePr>
-                  <a:graphic>
-                    <a:graphicData uri="http://schemas.openxmlformats.org/drawingml/2006/picture">
-                      <pic:pic>
-                        <pic:nvPicPr>
-                          <pic:cNvPr id="0" name="eurac.png"/>
-                          <pic:cNvPicPr/>
-                        </pic:nvPicPr>
-                        <pic:blipFill>
-                          <a:blip r:embed="rId13"/>
-                          <a:stretch>
-                            <a:fillRect/>
-                          </a:stretch>
-                        </pic:blipFill>
-                        <pic:spPr>
-                          <a:xfrm>
-                            <a:off x="0" y="0"/>
-                            <a:ext cx="777240" cy="777240"/>
-                          </a:xfrm>
-                          <a:prstGeom prst="rect"/>
-                        </pic:spPr>
-                      </pic:pic>
-                    </a:graphicData>
-                  </a:graphic>
-                </wp:inline>
-              </w:drawing>
-            </w:r>
-          </w:p>
-        </w:tc>
-      </w:tr>
-    </w:tbl>
-    <w:p>
-      <w:pPr>
-        <w:spacing w:after="40" w:line="144" w:lineRule="auto"/>
-      </w:pPr>
-    </w:p>
-    <w:tbl>
-      <w:tblPr>
-        <w:tblW w:type="auto" w:w="0"/>
-        <w:jc w:val="center"/>
-        <w:tblLayout w:type="fixed"/>
-        <w:tblLook w:firstColumn="1" w:firstRow="1" w:lastColumn="0" w:lastRow="0" w:noHBand="0" w:noVBand="1" w:val="04A0"/>
-        <w:tblLayout w:type="fixed"/>
-      </w:tblPr>
-      <w:tblGrid>
-        <w:gridCol w:w="5112"/>
-        <w:gridCol w:w="5112"/>
-      </w:tblGrid>
-      <w:tr>
-        <w:tc>
-          <w:tcPr>
-            <w:tcW w:type="dxa" w:w="1584"/>
-            <w:vAlign w:val="top"/>
-          </w:tcPr>
-          <w:p>
-            <w:pPr>
-              <w:jc w:val="center"/>
-            </w:pPr>
-            <w:r>
-              <w:drawing>
-                <wp:inline xmlns:a="http://schemas.openxmlformats.org/drawingml/2006/main" xmlns:pic="http://schemas.openxmlformats.org/drawingml/2006/picture">
-                  <wp:extent cx="777240" cy="777240"/>
-                  <wp:docPr id="7" name="Picture 7"/>
-                  <wp:cNvGraphicFramePr>
-                    <a:graphicFrameLocks noChangeAspect="1"/>
-                  </wp:cNvGraphicFramePr>
-                  <a:graphic>
-                    <a:graphicData uri="http://schemas.openxmlformats.org/drawingml/2006/picture">
-                      <pic:pic>
-                        <pic:nvPicPr>
-                          <pic:cNvPr id="0" name="mediaset.png"/>
-                          <pic:cNvPicPr/>
-                        </pic:nvPicPr>
-                        <pic:blipFill>
-                          <a:blip r:embed="rId14"/>
-                          <a:stretch>
-                            <a:fillRect/>
-                          </a:stretch>
-                        </pic:blipFill>
-                        <pic:spPr>
-                          <a:xfrm>
-                            <a:off x="0" y="0"/>
-                            <a:ext cx="777240" cy="777240"/>
-                          </a:xfrm>
-                          <a:prstGeom prst="rect"/>
-                        </pic:spPr>
-                      </pic:pic>
-                    </a:graphicData>
-                  </a:graphic>
-                </wp:inline>
-              </w:drawing>
-            </w:r>
-          </w:p>
-        </w:tc>
-        <w:tc>
-          <w:tcPr>
-            <w:tcW w:type="dxa" w:w="8640"/>
-            <w:tcBorders>
-              <w:left w:val="dashed" w:sz="8" w:space="0" w:color="2c3f51"/>
-            </w:tcBorders>
-            <w:vAlign w:val="top"/>
-          </w:tcPr>
-          <w:p>
-            <w:pPr>
-              <w:spacing w:after="0"/>
-              <w:jc w:val="left"/>
-            </w:pPr>
-            <w:r>
-              <w:rPr>
-                <w:b/>
-                <w:color w:val="2C3F51"/>
-                <w:sz w:val="26"/>
-              </w:rPr>
-              <w:t>Software Engineer (project)</w:t>
-            </w:r>
-          </w:p>
-          <w:p>
-            <w:pPr>
-              <w:spacing w:after="0"/>
-              <w:jc w:val="left"/>
-            </w:pPr>
-            <w:r>
-              <w:rPr>
-                <w:color w:val="2C3F51"/>
-              </w:rPr>
-              <w:t xml:space="preserve">Coolmedia Interactive / SmarDTV NAGRA Kudelski / </w:t>
-            </w:r>
-            <w:r>
-              <w:rPr>
-                <w:b/>
-                <w:color w:val="2C3F51"/>
-              </w:rPr>
-              <w:t>Mediaset S.p.A.</w:t>
-            </w:r>
-          </w:p>
-          <w:p>
-            <w:pPr>
-              <w:spacing w:after="80"/>
-              <w:jc w:val="left"/>
-            </w:pPr>
-            <w:r>
-              <w:rPr>
-                <w:i/>
-                <w:color w:val="666666"/>
-                <w:sz w:val="18"/>
-              </w:rPr>
-              <w:t>March 2014 – November 2014 · ~6 months · Rome / La Ciotat / Milan</w:t>
-            </w:r>
-          </w:p>
-          <w:p>
-            <w:pPr>
-              <w:spacing w:after="40"/>
-              <w:jc w:val="left"/>
-            </w:pPr>
-            <w:r>
-              <w:rPr>
-                <w:color w:val="2C3F51"/>
-              </w:rPr>
-              <w:t>Within the Mediaset Smartcam project for Mediaset Italy, together with Coolmedia Interactive we developed a hybrid iOS/Android application for a new generation of CAM CI+ that manages access to broadcast and on-demand Pay-TV content. The device was designed and manufactured by SmarDTV, a company belonging to the Kudelski Group. We spent a lot of time optimizing Sencha Touch rendering and developed our own Cordova plugins for SmartCAM device integration.</w:t>
-            </w:r>
-          </w:p>
-        </w:tc>
-      </w:tr>
-    </w:tbl>
-    <w:p>
-      <w:pPr>
-        <w:spacing w:after="40" w:line="144" w:lineRule="auto"/>
-      </w:pPr>
-    </w:p>
-    <w:tbl>
-      <w:tblPr>
-        <w:tblW w:type="auto" w:w="0"/>
-        <w:jc w:val="center"/>
-        <w:tblLayout w:type="fixed"/>
-        <w:tblLook w:firstColumn="1" w:firstRow="1" w:lastColumn="0" w:lastRow="0" w:noHBand="0" w:noVBand="1" w:val="04A0"/>
-        <w:tblLayout w:type="fixed"/>
-      </w:tblPr>
-      <w:tblGrid>
-        <w:gridCol w:w="5112"/>
-        <w:gridCol w:w="5112"/>
-      </w:tblGrid>
-      <w:tr>
-        <w:tc>
-          <w:tcPr>
-            <w:tcW w:type="dxa" w:w="8640"/>
-            <w:tcBorders>
-              <w:right w:val="dashed" w:sz="8" w:space="0" w:color="2c3f51"/>
-            </w:tcBorders>
-            <w:vAlign w:val="top"/>
-          </w:tcPr>
-          <w:p>
-            <w:pPr>
-              <w:spacing w:after="0"/>
-              <w:jc w:val="right"/>
-            </w:pPr>
-            <w:r>
-              <w:rPr>
-                <w:b/>
-                <w:color w:val="2C3F51"/>
-                <w:sz w:val="26"/>
-              </w:rPr>
-              <w:t>Invited Lecturer</w:t>
-            </w:r>
-          </w:p>
-          <w:p>
-            <w:pPr>
-              <w:spacing w:after="0"/>
-              <w:jc w:val="right"/>
-            </w:pPr>
-            <w:r>
-              <w:rPr>
-                <w:color w:val="2C3F51"/>
-              </w:rPr>
-              <w:t xml:space="preserve">CASE — Center for Applied Software Engineering / </w:t>
-            </w:r>
-            <w:r>
-              <w:rPr>
-                <w:b/>
-                <w:color w:val="2C3F51"/>
-              </w:rPr>
-              <w:t>General Staff of Italian Army</w:t>
-            </w:r>
-          </w:p>
-          <w:p>
-            <w:pPr>
-              <w:spacing w:after="80"/>
-              <w:jc w:val="right"/>
-            </w:pPr>
-            <w:r>
-              <w:rPr>
-                <w:i/>
-                <w:color w:val="666666"/>
-                <w:sz w:val="18"/>
-              </w:rPr>
-              <w:t>March 2012 · 1 week · Bolzano-Bozen / Rome, Italy</w:t>
-            </w:r>
-          </w:p>
-          <w:p>
-            <w:pPr>
-              <w:spacing w:after="40"/>
-              <w:jc w:val="right"/>
-            </w:pPr>
-            <w:r>
-              <w:rPr>
-                <w:color w:val="2C3F51"/>
-              </w:rPr>
-              <w:t>I gave a series of lectures (40h total) on Web Development and the Spring Framework for the General Staff of the Italian Army (Stato Maggiore dell'Esercito) as part of my PhD assignment.</w:t>
-            </w:r>
-          </w:p>
-        </w:tc>
-        <w:tc>
-          <w:tcPr>
-            <w:tcW w:type="dxa" w:w="1584"/>
-            <w:vAlign w:val="top"/>
-          </w:tcPr>
-          <w:p>
-            <w:pPr>
-              <w:jc w:val="center"/>
-            </w:pPr>
-            <w:r>
-              <w:drawing>
-                <wp:inline xmlns:a="http://schemas.openxmlformats.org/drawingml/2006/main" xmlns:pic="http://schemas.openxmlformats.org/drawingml/2006/picture">
-                  <wp:extent cx="777240" cy="777240"/>
-                  <wp:docPr id="8" name="Picture 8"/>
-                  <wp:cNvGraphicFramePr>
-                    <a:graphicFrameLocks noChangeAspect="1"/>
-                  </wp:cNvGraphicFramePr>
-                  <a:graphic>
-                    <a:graphicData uri="http://schemas.openxmlformats.org/drawingml/2006/picture">
-                      <pic:pic>
-                        <pic:nvPicPr>
-                          <pic:cNvPr id="0" name="esercito.png"/>
-                          <pic:cNvPicPr/>
-                        </pic:nvPicPr>
-                        <pic:blipFill>
-                          <a:blip r:embed="rId15"/>
-                          <a:stretch>
-                            <a:fillRect/>
-                          </a:stretch>
-                        </pic:blipFill>
-                        <pic:spPr>
-                          <a:xfrm>
-                            <a:off x="0" y="0"/>
-                            <a:ext cx="777240" cy="777240"/>
-                          </a:xfrm>
-                          <a:prstGeom prst="rect"/>
-                        </pic:spPr>
-                      </pic:pic>
-                    </a:graphicData>
-                  </a:graphic>
-                </wp:inline>
-              </w:drawing>
-            </w:r>
-          </w:p>
-        </w:tc>
-      </w:tr>
-    </w:tbl>
-    <w:p>
-      <w:pPr>
-        <w:spacing w:after="40" w:line="144" w:lineRule="auto"/>
-      </w:pPr>
-    </w:p>
-    <w:tbl>
-      <w:tblPr>
-        <w:tblW w:type="auto" w:w="0"/>
-        <w:jc w:val="center"/>
-        <w:tblLayout w:type="fixed"/>
-        <w:tblLook w:firstColumn="1" w:firstRow="1" w:lastColumn="0" w:lastRow="0" w:noHBand="0" w:noVBand="1" w:val="04A0"/>
-        <w:tblLayout w:type="fixed"/>
-      </w:tblPr>
-      <w:tblGrid>
-        <w:gridCol w:w="5112"/>
-        <w:gridCol w:w="5112"/>
-      </w:tblGrid>
-      <w:tr>
-        <w:tc>
-          <w:tcPr>
-            <w:tcW w:type="dxa" w:w="1584"/>
-            <w:vAlign w:val="top"/>
-          </w:tcPr>
-          <w:p>
-            <w:pPr>
-              <w:jc w:val="center"/>
-            </w:pPr>
-            <w:r>
-              <w:drawing>
-                <wp:inline xmlns:a="http://schemas.openxmlformats.org/drawingml/2006/main" xmlns:pic="http://schemas.openxmlformats.org/drawingml/2006/picture">
-                  <wp:extent cx="777240" cy="777240"/>
-                  <wp:docPr id="9" name="Picture 9"/>
-                  <wp:cNvGraphicFramePr>
-                    <a:graphicFrameLocks noChangeAspect="1"/>
-                  </wp:cNvGraphicFramePr>
-                  <a:graphic>
-                    <a:graphicData uri="http://schemas.openxmlformats.org/drawingml/2006/picture">
-                      <pic:pic>
-                        <pic:nvPicPr>
-                          <pic:cNvPr id="0" name="solhea.png"/>
-                          <pic:cNvPicPr/>
-                        </pic:nvPicPr>
-                        <pic:blipFill>
-                          <a:blip r:embed="rId10"/>
-                          <a:stretch>
-                            <a:fillRect/>
-                          </a:stretch>
-                        </pic:blipFill>
-                        <pic:spPr>
-                          <a:xfrm>
-                            <a:off x="0" y="0"/>
-                            <a:ext cx="777240" cy="777240"/>
-                          </a:xfrm>
-                          <a:prstGeom prst="rect"/>
-                        </pic:spPr>
-                      </pic:pic>
-                    </a:graphicData>
-                  </a:graphic>
-                </wp:inline>
-              </w:drawing>
-            </w:r>
-          </w:p>
-        </w:tc>
-        <w:tc>
-          <w:tcPr>
-            <w:tcW w:type="dxa" w:w="8640"/>
-            <w:tcBorders>
-              <w:left w:val="dashed" w:sz="8" w:space="0" w:color="2c3f51"/>
-            </w:tcBorders>
-            <w:vAlign w:val="top"/>
-          </w:tcPr>
-          <w:p>
-            <w:pPr>
-              <w:spacing w:after="0"/>
-              <w:jc w:val="left"/>
-            </w:pPr>
-            <w:r>
-              <w:rPr>
-                <w:b/>
-                <w:color w:val="2C3F51"/>
-                <w:sz w:val="26"/>
-              </w:rPr>
-              <w:t>Consultant / Engineer (projects)</w:t>
-            </w:r>
-          </w:p>
-          <w:p>
-            <w:pPr>
-              <w:spacing w:after="0"/>
-              <w:jc w:val="left"/>
-            </w:pPr>
-            <w:r>
-              <w:rPr>
-                <w:b/>
-                <w:color w:val="1980E6"/>
-              </w:rPr>
-              <w:t>SOLHEA Srl / Inquiria / EDP Progetti s.r.l.</w:t>
-            </w:r>
-          </w:p>
-          <w:p>
-            <w:pPr>
-              <w:spacing w:after="80"/>
-              <w:jc w:val="left"/>
-            </w:pPr>
-            <w:r>
-              <w:rPr>
-                <w:i/>
-                <w:color w:val="666666"/>
-                <w:sz w:val="18"/>
-              </w:rPr>
-              <w:t>August 2013 – May 2018 · Bolzano-Bozen, Italy</w:t>
-            </w:r>
-          </w:p>
-          <w:p>
-            <w:pPr>
-              <w:spacing w:after="40"/>
-              <w:jc w:val="left"/>
-            </w:pPr>
-            <w:r>
-              <w:rPr>
-                <w:color w:val="2C3F51"/>
-              </w:rPr>
-              <w:t>We established a long-term collaboration with Solhea Srl (and its legal predecessors), where I contributed as an on-demand consultant/engineer on several (mainly medical) projects:</w:t>
-            </w:r>
-          </w:p>
-          <w:p>
-            <w:pPr>
-              <w:spacing w:after="80"/>
-              <w:jc w:val="left"/>
-            </w:pPr>
-            <w:r>
-              <w:drawing>
-                <wp:inline xmlns:a="http://schemas.openxmlformats.org/drawingml/2006/main" xmlns:pic="http://schemas.openxmlformats.org/drawingml/2006/picture">
-                  <wp:extent cx="457200" cy="457200"/>
-                  <wp:docPr id="10" name="Picture 10"/>
-                  <wp:cNvGraphicFramePr>
-                    <a:graphicFrameLocks noChangeAspect="1"/>
-                  </wp:cNvGraphicFramePr>
-                  <a:graphic>
-                    <a:graphicData uri="http://schemas.openxmlformats.org/drawingml/2006/picture">
-                      <pic:pic>
-                        <pic:nvPicPr>
-                          <pic:cNvPr id="0" name="titengo.png"/>
-                          <pic:cNvPicPr/>
-                        </pic:nvPicPr>
-                        <pic:blipFill>
-                          <a:blip r:embed="rId16"/>
-                          <a:stretch>
-                            <a:fillRect/>
-                          </a:stretch>
-                        </pic:blipFill>
-                        <pic:spPr>
-                          <a:xfrm>
-                            <a:off x="0" y="0"/>
-                            <a:ext cx="457200" cy="457200"/>
-                          </a:xfrm>
-                          <a:prstGeom prst="rect"/>
-                        </pic:spPr>
-                      </pic:pic>
-                    </a:graphicData>
-                  </a:graphic>
-                </wp:inline>
-              </w:drawing>
-            </w:r>
-            <w:r>
-              <w:t xml:space="preserve">  </w:t>
-            </w:r>
-            <w:r>
-              <w:rPr>
-                <w:b/>
-                <w:color w:val="2C3F51"/>
-              </w:rPr>
-              <w:t>TiTengoInformato</w:t>
-            </w:r>
-            <w:r>
-              <w:rPr>
-                <w:color w:val="2C3F51"/>
-              </w:rPr>
-              <w:t xml:space="preserve"> — the first app of its kind in Italy able to provide a real-time connection between the inner part of a hospital's first-aid process and the outer world, making relatives aware of diagnostic and therapeutic events inside emergency rooms. My part: a patients' PWA built in Stencil.js and an admin app in Ionic. I also designed and implemented the API services for authentication and proxying to hospital services in GraphQL, PostgreSQL and Node.js (leveraging TypeScript).</w:t>
-            </w:r>
-          </w:p>
-          <w:p>
-            <w:pPr>
-              <w:spacing w:after="80"/>
-              <w:jc w:val="left"/>
-            </w:pPr>
-            <w:r>
-              <w:drawing>
-                <wp:inline xmlns:a="http://schemas.openxmlformats.org/drawingml/2006/main" xmlns:pic="http://schemas.openxmlformats.org/drawingml/2006/picture">
-                  <wp:extent cx="457200" cy="457200"/>
-                  <wp:docPr id="11" name="Picture 11"/>
-                  <wp:cNvGraphicFramePr>
-                    <a:graphicFrameLocks noChangeAspect="1"/>
-                  </wp:cNvGraphicFramePr>
-                  <a:graphic>
-                    <a:graphicData uri="http://schemas.openxmlformats.org/drawingml/2006/picture">
-                      <pic:pic>
-                        <pic:nvPicPr>
-                          <pic:cNvPr id="0" name="easyrec.png"/>
-                          <pic:cNvPicPr/>
-                        </pic:nvPicPr>
-                        <pic:blipFill>
-                          <a:blip r:embed="rId17"/>
-                          <a:stretch>
-                            <a:fillRect/>
-                          </a:stretch>
-                        </pic:blipFill>
-                        <pic:spPr>
-                          <a:xfrm>
-                            <a:off x="0" y="0"/>
-                            <a:ext cx="457200" cy="457200"/>
-                          </a:xfrm>
-                          <a:prstGeom prst="rect"/>
-                        </pic:spPr>
-                      </pic:pic>
-                    </a:graphicData>
-                  </a:graphic>
-                </wp:inline>
-              </w:drawing>
-            </w:r>
-            <w:r>
-              <w:t xml:space="preserve">  </w:t>
-            </w:r>
-            <w:r>
-              <w:rPr>
-                <w:b/>
-                <w:color w:val="2C3F51"/>
-              </w:rPr>
-              <w:t>EasyRec</w:t>
-            </w:r>
-            <w:r>
-              <w:rPr>
-                <w:color w:val="2C3F51"/>
-              </w:rPr>
-              <w:t xml:space="preserve"> — over 2 years Inquiria Investigations invested in several applications and services. EasyRec, a solution for credit collectors, is one of them. I performed the analysis, developed the specification, and built the system: the client (iOS and Android) in Ionic and a Node.js REST API server integrated with the existing back-office system.</w:t>
-            </w:r>
-          </w:p>
-          <w:p>
-            <w:pPr>
-              <w:spacing w:after="80"/>
-              <w:jc w:val="left"/>
-            </w:pPr>
-            <w:r>
-              <w:drawing>
-                <wp:inline xmlns:a="http://schemas.openxmlformats.org/drawingml/2006/main" xmlns:pic="http://schemas.openxmlformats.org/drawingml/2006/picture">
-                  <wp:extent cx="457200" cy="457200"/>
-                  <wp:docPr id="12" name="Picture 12"/>
-                  <wp:cNvGraphicFramePr>
-                    <a:graphicFrameLocks noChangeAspect="1"/>
-                  </wp:cNvGraphicFramePr>
-                  <a:graphic>
-                    <a:graphicData uri="http://schemas.openxmlformats.org/drawingml/2006/picture">
-                      <pic:pic>
-                        <pic:nvPicPr>
-                          <pic:cNvPr id="0" name="roche.png"/>
-                          <pic:cNvPicPr/>
-                        </pic:nvPicPr>
-                        <pic:blipFill>
-                          <a:blip r:embed="rId18"/>
-                          <a:stretch>
-                            <a:fillRect/>
-                          </a:stretch>
-                        </pic:blipFill>
-                        <pic:spPr>
-                          <a:xfrm>
-                            <a:off x="0" y="0"/>
-                            <a:ext cx="457200" cy="457200"/>
-                          </a:xfrm>
-                          <a:prstGeom prst="rect"/>
-                        </pic:spPr>
-                      </pic:pic>
-                    </a:graphicData>
-                  </a:graphic>
-                </wp:inline>
-              </w:drawing>
-            </w:r>
-            <w:r>
-              <w:t xml:space="preserve">  </w:t>
-            </w:r>
-            <w:r>
-              <w:rPr>
-                <w:b/>
-                <w:color w:val="2C3F51"/>
-              </w:rPr>
-              <w:t>TaoTouch</w:t>
-            </w:r>
-            <w:r>
-              <w:rPr>
-                <w:color w:val="2C3F51"/>
-              </w:rPr>
-              <w:t xml:space="preserve"> — a pilot project with Roche Diagnostics: a hybrid app and web service that lets doctors follow patients and evaluate treatment progress. I developed the iOS/Android app in JavaScript/Ionic and a server-side REST service connected to the original Oracle database in Java/Spring/Hibernate. Working with Roche R&amp;D, we implemented a Cordova plugin to extract data from anticoagulation devices via Bluetooth using the proprietary binary protocol.</w:t>
-            </w:r>
-          </w:p>
-        </w:tc>
-      </w:tr>
-    </w:tbl>
-    <w:p>
-      <w:pPr>
-        <w:spacing w:after="40" w:line="144" w:lineRule="auto"/>
-      </w:pPr>
-    </w:p>
-    <w:tbl>
-      <w:tblPr>
-        <w:tblW w:type="auto" w:w="0"/>
-        <w:jc w:val="center"/>
-        <w:tblLayout w:type="fixed"/>
-        <w:tblLook w:firstColumn="1" w:firstRow="1" w:lastColumn="0" w:lastRow="0" w:noHBand="0" w:noVBand="1" w:val="04A0"/>
-        <w:tblLayout w:type="fixed"/>
-      </w:tblPr>
-      <w:tblGrid>
-        <w:gridCol w:w="5112"/>
-        <w:gridCol w:w="5112"/>
-      </w:tblGrid>
-      <w:tr>
-        <w:tc>
-          <w:tcPr>
-            <w:tcW w:type="dxa" w:w="8640"/>
-            <w:tcBorders>
-              <w:right w:val="dashed" w:sz="8" w:space="0" w:color="2c3f51"/>
-            </w:tcBorders>
-            <w:vAlign w:val="top"/>
-          </w:tcPr>
-          <w:p>
-            <w:pPr>
-              <w:spacing w:after="0"/>
-              <w:jc w:val="right"/>
-            </w:pPr>
-            <w:r>
-              <w:rPr>
-                <w:b/>
-                <w:color w:val="2C3F51"/>
-                <w:sz w:val="26"/>
-              </w:rPr>
-              <w:t>Co-founder at NexTrailer</w:t>
-            </w:r>
-          </w:p>
-          <w:p>
-            <w:pPr>
-              <w:spacing w:after="0"/>
-              <w:jc w:val="right"/>
-            </w:pPr>
-            <w:r>
-              <w:rPr>
-                <w:b/>
-                <w:color w:val="2C3F51"/>
-              </w:rPr>
-              <w:t>ISIS Software Incubator at Oxford University</w:t>
-            </w:r>
-          </w:p>
-          <w:p>
-            <w:pPr>
-              <w:spacing w:after="80"/>
-              <w:jc w:val="right"/>
-            </w:pPr>
-            <w:r>
-              <w:rPr>
-                <w:i/>
-                <w:color w:val="666666"/>
-                <w:sz w:val="18"/>
-              </w:rPr>
-              <w:t>December 2011 – August 2014 · ~1 year · Bolzano-Bozen, Italy / Oxford, UK</w:t>
-            </w:r>
-          </w:p>
-          <w:p>
-            <w:pPr>
-              <w:spacing w:after="40"/>
-              <w:jc w:val="right"/>
-            </w:pPr>
-            <w:r>
-              <w:rPr>
-                <w:color w:val="2C3F51"/>
-              </w:rPr>
-              <w:t>NexTrailer was a movie-search startup based on movie trailers. I was one of the co-founders and my main responsibility was the UI features. For a year NexTrailer was part of the ISIS Software Incubator at Oxford University and then successfully wound down, but it served one of the co-founders in defending their PhD thesis on Feature Reduction in Software Systems.</w:t>
-            </w:r>
-          </w:p>
-        </w:tc>
-        <w:tc>
-          <w:tcPr>
-            <w:tcW w:type="dxa" w:w="1584"/>
-            <w:vAlign w:val="top"/>
-          </w:tcPr>
-          <w:p>
-            <w:pPr>
-              <w:jc w:val="center"/>
-            </w:pPr>
-            <w:r>
-              <w:drawing>
-                <wp:inline xmlns:a="http://schemas.openxmlformats.org/drawingml/2006/main" xmlns:pic="http://schemas.openxmlformats.org/drawingml/2006/picture">
-                  <wp:extent cx="777240" cy="777240"/>
-                  <wp:docPr id="13" name="Picture 13"/>
-                  <wp:cNvGraphicFramePr>
-                    <a:graphicFrameLocks noChangeAspect="1"/>
-                  </wp:cNvGraphicFramePr>
-                  <a:graphic>
-                    <a:graphicData uri="http://schemas.openxmlformats.org/drawingml/2006/picture">
-                      <pic:pic>
-                        <pic:nvPicPr>
-                          <pic:cNvPr id="0" name="oxford.png"/>
-                          <pic:cNvPicPr/>
-                        </pic:nvPicPr>
-                        <pic:blipFill>
-                          <a:blip r:embed="rId19"/>
-                          <a:stretch>
-                            <a:fillRect/>
-                          </a:stretch>
-                        </pic:blipFill>
-                        <pic:spPr>
-                          <a:xfrm>
-                            <a:off x="0" y="0"/>
-                            <a:ext cx="777240" cy="777240"/>
-                          </a:xfrm>
-                          <a:prstGeom prst="rect"/>
-                        </pic:spPr>
-                      </pic:pic>
-                    </a:graphicData>
-                  </a:graphic>
-                </wp:inline>
-              </w:drawing>
-            </w:r>
-          </w:p>
-        </w:tc>
-      </w:tr>
-    </w:tbl>
-    <w:p>
-      <w:pPr>
-        <w:spacing w:after="40" w:line="144" w:lineRule="auto"/>
-      </w:pPr>
-    </w:p>
-    <w:tbl>
-      <w:tblPr>
-        <w:tblW w:type="auto" w:w="0"/>
-        <w:jc w:val="center"/>
-        <w:tblLayout w:type="fixed"/>
-        <w:tblLook w:firstColumn="1" w:firstRow="1" w:lastColumn="0" w:lastRow="0" w:noHBand="0" w:noVBand="1" w:val="04A0"/>
-        <w:tblLayout w:type="fixed"/>
-      </w:tblPr>
-      <w:tblGrid>
-        <w:gridCol w:w="5112"/>
-        <w:gridCol w:w="5112"/>
-      </w:tblGrid>
-      <w:tr>
-        <w:tc>
-          <w:tcPr>
-            <w:tcW w:type="dxa" w:w="1584"/>
-            <w:vAlign w:val="top"/>
-          </w:tcPr>
-          <w:p>
-            <w:pPr>
-              <w:jc w:val="center"/>
-            </w:pPr>
-            <w:r>
-              <w:drawing>
-                <wp:inline xmlns:a="http://schemas.openxmlformats.org/drawingml/2006/main" xmlns:pic="http://schemas.openxmlformats.org/drawingml/2006/picture">
-                  <wp:extent cx="777240" cy="777240"/>
-                  <wp:docPr id="14" name="Picture 14"/>
-                  <wp:cNvGraphicFramePr>
-                    <a:graphicFrameLocks noChangeAspect="1"/>
-                  </wp:cNvGraphicFramePr>
-                  <a:graphic>
-                    <a:graphicData uri="http://schemas.openxmlformats.org/drawingml/2006/picture">
-                      <pic:pic>
-                        <pic:nvPicPr>
-                          <pic:cNvPr id="0" name="42matters.png"/>
-                          <pic:cNvPicPr/>
-                        </pic:nvPicPr>
-                        <pic:blipFill>
-                          <a:blip r:embed="rId20"/>
-                          <a:stretch>
-                            <a:fillRect/>
-                          </a:stretch>
-                        </pic:blipFill>
-                        <pic:spPr>
-                          <a:xfrm>
-                            <a:off x="0" y="0"/>
-                            <a:ext cx="777240" cy="777240"/>
-                          </a:xfrm>
-                          <a:prstGeom prst="rect"/>
-                        </pic:spPr>
-                      </pic:pic>
-                    </a:graphicData>
-                  </a:graphic>
-                </wp:inline>
-              </w:drawing>
-            </w:r>
-          </w:p>
-        </w:tc>
-        <w:tc>
-          <w:tcPr>
-            <w:tcW w:type="dxa" w:w="8640"/>
-            <w:tcBorders>
-              <w:left w:val="dashed" w:sz="8" w:space="0" w:color="2c3f51"/>
-            </w:tcBorders>
-            <w:vAlign w:val="top"/>
-          </w:tcPr>
-          <w:p>
-            <w:pPr>
-              <w:spacing w:after="0"/>
-              <w:jc w:val="left"/>
-            </w:pPr>
-            <w:r>
-              <w:rPr>
-                <w:b/>
-                <w:color w:val="2C3F51"/>
-                <w:sz w:val="26"/>
-              </w:rPr>
-              <w:t>Data visualisation and analytics (project)</w:t>
-            </w:r>
-          </w:p>
-          <w:p>
-            <w:pPr>
-              <w:spacing w:after="0"/>
-              <w:jc w:val="left"/>
-            </w:pPr>
-            <w:r>
-              <w:rPr>
-                <w:b/>
-                <w:color w:val="2C3F51"/>
-              </w:rPr>
-              <w:t>42matters AG</w:t>
-            </w:r>
-          </w:p>
-          <w:p>
-            <w:pPr>
-              <w:spacing w:after="80"/>
-              <w:jc w:val="left"/>
-            </w:pPr>
-            <w:r>
-              <w:rPr>
-                <w:i/>
-                <w:color w:val="666666"/>
-                <w:sz w:val="18"/>
-              </w:rPr>
-              <w:t>October 2011 – December 2011 · ~3 months · Bolzano-Bozen, Italy / Zürich</w:t>
-            </w:r>
-          </w:p>
-          <w:p>
-            <w:pPr>
-              <w:spacing w:after="40"/>
-              <w:jc w:val="left"/>
-            </w:pPr>
-            <w:r>
-              <w:rPr>
-                <w:color w:val="2C3F51"/>
-              </w:rPr>
-              <w:t xml:space="preserve">I helped my friends from the ETH spin-off 42matters develop an analysis and visualization tool for their Appaware Android Application Market using </w:t>
-            </w:r>
-            <w:r>
-              <w:rPr>
-                <w:b/>
-                <w:color w:val="2C3F51"/>
-              </w:rPr>
-              <w:t>MongoDB</w:t>
-            </w:r>
-            <w:r>
-              <w:rPr>
-                <w:color w:val="2C3F51"/>
-              </w:rPr>
-              <w:t xml:space="preserve"> aggregations and some HTML/CSS/JS. The main task was to predict a better application release/update time slot and suggest price ranges for different market segments.</w:t>
-            </w:r>
-          </w:p>
-        </w:tc>
-      </w:tr>
-    </w:tbl>
-    <w:p>
-      <w:pPr>
-        <w:spacing w:after="40" w:line="144" w:lineRule="auto"/>
-      </w:pPr>
     </w:p>
     <w:p>
       <w:pPr>
-        <w:pBdr>
-          <w:bottom w:val="single" w:sz="6" w:space="1" w:color="999999"/>
-        </w:pBdr>
-        <w:spacing w:after="40"/>
-      </w:pPr>
-    </w:p>
-    <w:p>
-      <w:pPr>
-        <w:spacing w:before="200" w:after="120"/>
+        <w:spacing w:before="0" w:after="40"/>
       </w:pPr>
       <w:r>
         <w:rPr>
           <w:b/>
-          <w:color w:val="2C3F51"/>
-          <w:sz w:val="36"/>
+          <w:i/>
+          <w:sz w:val="20"/>
         </w:rPr>
-        <w:t>Education</w:t>
+        <w:t>Siemens Energy</w:t>
       </w:r>
-    </w:p>
-    <w:tbl>
-      <w:tblPr>
-        <w:tblW w:type="auto" w:w="0"/>
-        <w:jc w:val="center"/>
-        <w:tblLayout w:type="fixed"/>
-        <w:tblLook w:firstColumn="1" w:firstRow="1" w:lastColumn="0" w:lastRow="0" w:noHBand="0" w:noVBand="1" w:val="04A0"/>
-        <w:tblLayout w:type="fixed"/>
-      </w:tblPr>
-      <w:tblGrid>
-        <w:gridCol w:w="5112"/>
-        <w:gridCol w:w="5112"/>
-      </w:tblGrid>
-      <w:tr>
-        <w:tc>
-          <w:tcPr>
-            <w:tcW w:type="dxa" w:w="1584"/>
-            <w:vAlign w:val="top"/>
-          </w:tcPr>
-          <w:p>
-            <w:pPr>
-              <w:jc w:val="center"/>
-            </w:pPr>
-            <w:r>
-              <w:drawing>
-                <wp:inline xmlns:a="http://schemas.openxmlformats.org/drawingml/2006/main" xmlns:pic="http://schemas.openxmlformats.org/drawingml/2006/picture">
-                  <wp:extent cx="777240" cy="777240"/>
-                  <wp:docPr id="15" name="Picture 15"/>
-                  <wp:cNvGraphicFramePr>
-                    <a:graphicFrameLocks noChangeAspect="1"/>
-                  </wp:cNvGraphicFramePr>
-                  <a:graphic>
-                    <a:graphicData uri="http://schemas.openxmlformats.org/drawingml/2006/picture">
-                      <pic:pic>
-                        <pic:nvPicPr>
-                          <pic:cNvPr id="0" name="unibz.png"/>
-                          <pic:cNvPicPr/>
-                        </pic:nvPicPr>
-                        <pic:blipFill>
-                          <a:blip r:embed="rId21"/>
-                          <a:stretch>
-                            <a:fillRect/>
-                          </a:stretch>
-                        </pic:blipFill>
-                        <pic:spPr>
-                          <a:xfrm>
-                            <a:off x="0" y="0"/>
-                            <a:ext cx="777240" cy="777240"/>
-                          </a:xfrm>
-                          <a:prstGeom prst="rect"/>
-                        </pic:spPr>
-                      </pic:pic>
-                    </a:graphicData>
-                  </a:graphic>
-                </wp:inline>
-              </w:drawing>
-            </w:r>
-          </w:p>
-        </w:tc>
-        <w:tc>
-          <w:tcPr>
-            <w:tcW w:type="dxa" w:w="8640"/>
-            <w:tcBorders>
-              <w:left w:val="dashed" w:sz="8" w:space="0" w:color="2c3f51"/>
-            </w:tcBorders>
-            <w:vAlign w:val="top"/>
-          </w:tcPr>
-          <w:p>
-            <w:pPr>
-              <w:spacing w:after="0"/>
-              <w:jc w:val="left"/>
-            </w:pPr>
-            <w:r>
-              <w:rPr>
-                <w:b/>
-                <w:color w:val="2C3F51"/>
-                <w:sz w:val="26"/>
-              </w:rPr>
-              <w:t>PhD in Software Engineering (suspended)</w:t>
-            </w:r>
-          </w:p>
-          <w:p>
-            <w:pPr>
-              <w:spacing w:after="0"/>
-              <w:jc w:val="left"/>
-            </w:pPr>
-            <w:r>
-              <w:rPr>
-                <w:b/>
-                <w:color w:val="2C3F51"/>
-              </w:rPr>
-              <w:t>Free University of Bolzano-Bozen, Italy</w:t>
-            </w:r>
-          </w:p>
-          <w:p>
-            <w:pPr>
-              <w:spacing w:after="80"/>
-              <w:jc w:val="left"/>
-            </w:pPr>
-            <w:r>
-              <w:rPr>
-                <w:i/>
-                <w:color w:val="666666"/>
-                <w:sz w:val="18"/>
-              </w:rPr>
-              <w:t>January 2012 – January 2013 · ~1 year · Bolzano-Bozen, Italy</w:t>
-            </w:r>
-          </w:p>
-          <w:p>
-            <w:pPr>
-              <w:spacing w:after="40"/>
-              <w:jc w:val="left"/>
-            </w:pPr>
-            <w:r>
-              <w:rPr>
-                <w:color w:val="2C3F51"/>
-              </w:rPr>
-              <w:t>PhD topic: Regression testing effectiveness in a black-box environment.</w:t>
-            </w:r>
-          </w:p>
-        </w:tc>
-      </w:tr>
-    </w:tbl>
-    <w:p>
-      <w:pPr>
-        <w:spacing w:after="40" w:line="144" w:lineRule="auto"/>
-      </w:pPr>
-    </w:p>
-    <w:tbl>
-      <w:tblPr>
-        <w:tblW w:type="auto" w:w="0"/>
-        <w:jc w:val="center"/>
-        <w:tblLayout w:type="fixed"/>
-        <w:tblLook w:firstColumn="1" w:firstRow="1" w:lastColumn="0" w:lastRow="0" w:noHBand="0" w:noVBand="1" w:val="04A0"/>
-        <w:tblLayout w:type="fixed"/>
-      </w:tblPr>
-      <w:tblGrid>
-        <w:gridCol w:w="5112"/>
-        <w:gridCol w:w="5112"/>
-      </w:tblGrid>
-      <w:tr>
-        <w:tc>
-          <w:tcPr>
-            <w:tcW w:type="dxa" w:w="8640"/>
-            <w:tcBorders>
-              <w:right w:val="dashed" w:sz="8" w:space="0" w:color="2c3f51"/>
-            </w:tcBorders>
-            <w:vAlign w:val="top"/>
-          </w:tcPr>
-          <w:p>
-            <w:pPr>
-              <w:spacing w:after="0"/>
-              <w:jc w:val="right"/>
-            </w:pPr>
-            <w:r>
-              <w:rPr>
-                <w:b/>
-                <w:color w:val="2C3F51"/>
-                <w:sz w:val="26"/>
-              </w:rPr>
-              <w:t>Master in Computer Science (MSc)</w:t>
-            </w:r>
-          </w:p>
-          <w:p>
-            <w:pPr>
-              <w:spacing w:after="0"/>
-              <w:jc w:val="right"/>
-            </w:pPr>
-            <w:r>
-              <w:rPr>
-                <w:color w:val="2C3F51"/>
-              </w:rPr>
-              <w:t xml:space="preserve">Free University of Bolzano-Bozen — </w:t>
-            </w:r>
-            <w:r>
-              <w:rPr>
-                <w:b/>
-                <w:color w:val="2C3F51"/>
-              </w:rPr>
-              <w:t>Center of Applied Software Engineering (CASE)</w:t>
-            </w:r>
-          </w:p>
-          <w:p>
-            <w:pPr>
-              <w:spacing w:after="80"/>
-              <w:jc w:val="right"/>
-            </w:pPr>
-            <w:r>
-              <w:rPr>
-                <w:i/>
-                <w:color w:val="666666"/>
-                <w:sz w:val="18"/>
-              </w:rPr>
-              <w:t>October 2007 – March 2011 · ~3 years · Bolzano-Bozen, Italy</w:t>
-            </w:r>
-          </w:p>
-          <w:p>
-            <w:pPr>
-              <w:spacing w:after="40"/>
-              <w:jc w:val="right"/>
-            </w:pPr>
-            <w:r>
-              <w:rPr>
-                <w:color w:val="2C3F51"/>
-              </w:rPr>
-              <w:t>MSc thesis: Entropy-based test prioritization in a black-box environment.</w:t>
-            </w:r>
-          </w:p>
-        </w:tc>
-        <w:tc>
-          <w:tcPr>
-            <w:tcW w:type="dxa" w:w="1584"/>
-            <w:vAlign w:val="top"/>
-          </w:tcPr>
-          <w:p>
-            <w:pPr>
-              <w:jc w:val="center"/>
-            </w:pPr>
-            <w:r>
-              <w:drawing>
-                <wp:inline xmlns:a="http://schemas.openxmlformats.org/drawingml/2006/main" xmlns:pic="http://schemas.openxmlformats.org/drawingml/2006/picture">
-                  <wp:extent cx="777240" cy="777240"/>
-                  <wp:docPr id="16" name="Picture 16"/>
-                  <wp:cNvGraphicFramePr>
-                    <a:graphicFrameLocks noChangeAspect="1"/>
-                  </wp:cNvGraphicFramePr>
-                  <a:graphic>
-                    <a:graphicData uri="http://schemas.openxmlformats.org/drawingml/2006/picture">
-                      <pic:pic>
-                        <pic:nvPicPr>
-                          <pic:cNvPr id="0" name="case.png"/>
-                          <pic:cNvPicPr/>
-                        </pic:nvPicPr>
-                        <pic:blipFill>
-                          <a:blip r:embed="rId22"/>
-                          <a:stretch>
-                            <a:fillRect/>
-                          </a:stretch>
-                        </pic:blipFill>
-                        <pic:spPr>
-                          <a:xfrm>
-                            <a:off x="0" y="0"/>
-                            <a:ext cx="777240" cy="777240"/>
-                          </a:xfrm>
-                          <a:prstGeom prst="rect"/>
-                        </pic:spPr>
-                      </pic:pic>
-                    </a:graphicData>
-                  </a:graphic>
-                </wp:inline>
-              </w:drawing>
-            </w:r>
-          </w:p>
-        </w:tc>
-      </w:tr>
-    </w:tbl>
-    <w:p>
-      <w:pPr>
-        <w:spacing w:after="40" w:line="144" w:lineRule="auto"/>
-      </w:pPr>
-    </w:p>
-    <w:tbl>
-      <w:tblPr>
-        <w:tblW w:type="auto" w:w="0"/>
-        <w:jc w:val="center"/>
-        <w:tblLayout w:type="fixed"/>
-        <w:tblLook w:firstColumn="1" w:firstRow="1" w:lastColumn="0" w:lastRow="0" w:noHBand="0" w:noVBand="1" w:val="04A0"/>
-        <w:tblLayout w:type="fixed"/>
-      </w:tblPr>
-      <w:tblGrid>
-        <w:gridCol w:w="5112"/>
-        <w:gridCol w:w="5112"/>
-      </w:tblGrid>
-      <w:tr>
-        <w:tc>
-          <w:tcPr>
-            <w:tcW w:type="dxa" w:w="1584"/>
-            <w:vAlign w:val="top"/>
-          </w:tcPr>
-          <w:p>
-            <w:pPr>
-              <w:jc w:val="center"/>
-            </w:pPr>
-            <w:r>
-              <w:drawing>
-                <wp:inline xmlns:a="http://schemas.openxmlformats.org/drawingml/2006/main" xmlns:pic="http://schemas.openxmlformats.org/drawingml/2006/picture">
-                  <wp:extent cx="777240" cy="777240"/>
-                  <wp:docPr id="17" name="Picture 17"/>
-                  <wp:cNvGraphicFramePr>
-                    <a:graphicFrameLocks noChangeAspect="1"/>
-                  </wp:cNvGraphicFramePr>
-                  <a:graphic>
-                    <a:graphicData uri="http://schemas.openxmlformats.org/drawingml/2006/picture">
-                      <pic:pic>
-                        <pic:nvPicPr>
-                          <pic:cNvPr id="0" name="nsu.png"/>
-                          <pic:cNvPicPr/>
-                        </pic:nvPicPr>
-                        <pic:blipFill>
-                          <a:blip r:embed="rId23"/>
-                          <a:stretch>
-                            <a:fillRect/>
-                          </a:stretch>
-                        </pic:blipFill>
-                        <pic:spPr>
-                          <a:xfrm>
-                            <a:off x="0" y="0"/>
-                            <a:ext cx="777240" cy="777240"/>
-                          </a:xfrm>
-                          <a:prstGeom prst="rect"/>
-                        </pic:spPr>
-                      </pic:pic>
-                    </a:graphicData>
-                  </a:graphic>
-                </wp:inline>
-              </w:drawing>
-            </w:r>
-          </w:p>
-        </w:tc>
-        <w:tc>
-          <w:tcPr>
-            <w:tcW w:type="dxa" w:w="8640"/>
-            <w:tcBorders>
-              <w:left w:val="dashed" w:sz="8" w:space="0" w:color="2c3f51"/>
-            </w:tcBorders>
-            <w:vAlign w:val="top"/>
-          </w:tcPr>
-          <w:p>
-            <w:pPr>
-              <w:spacing w:after="0"/>
-              <w:jc w:val="left"/>
-            </w:pPr>
-            <w:r>
-              <w:rPr>
-                <w:b/>
-                <w:color w:val="2C3F51"/>
-                <w:sz w:val="26"/>
-              </w:rPr>
-              <w:t>BSc in Applied Mathematics (4 years)</w:t>
-            </w:r>
-          </w:p>
-          <w:p>
-            <w:pPr>
-              <w:spacing w:after="0"/>
-              <w:jc w:val="left"/>
-            </w:pPr>
-            <w:r>
-              <w:rPr>
-                <w:b/>
-                <w:color w:val="2C3F51"/>
-              </w:rPr>
-              <w:t>State University of Novosibirsk (NSU)</w:t>
-            </w:r>
-          </w:p>
-          <w:p>
-            <w:pPr>
-              <w:spacing w:after="80"/>
-              <w:jc w:val="left"/>
-            </w:pPr>
-            <w:r>
-              <w:rPr>
-                <w:i/>
-                <w:color w:val="666666"/>
-                <w:sz w:val="18"/>
-              </w:rPr>
-              <w:t>September 2002 – July 2006 · 4 years · Novosibirsk, Akademgorodok, Russia</w:t>
-            </w:r>
-          </w:p>
-          <w:p>
-            <w:pPr>
-              <w:spacing w:after="40"/>
-              <w:jc w:val="left"/>
-            </w:pPr>
-            <w:r>
-              <w:rPr>
-                <w:color w:val="2C3F51"/>
-              </w:rPr>
-              <w:t>BSc thesis: Semantic-based reinforcement learning algorithm.</w:t>
-            </w:r>
-          </w:p>
-        </w:tc>
-      </w:tr>
-    </w:tbl>
-    <w:p>
-      <w:pPr>
-        <w:spacing w:after="40" w:line="144" w:lineRule="auto"/>
-      </w:pPr>
+      <w:r>
+        <w:rPr>
+          <w:b w:val="0"/>
+          <w:i/>
+          <w:sz w:val="20"/>
+        </w:rPr>
+        <w:t>, 2026 - Now, Italy remote</w:t>
+      </w:r>
     </w:p>
     <w:p>
       <w:pPr>
-        <w:pBdr>
-          <w:bottom w:val="single" w:sz="6" w:space="1" w:color="999999"/>
-        </w:pBdr>
-        <w:spacing w:after="40"/>
+        <w:spacing w:before="0" w:after="80"/>
       </w:pPr>
+      <w:r>
+        <w:rPr>
+          <w:b w:val="0"/>
+          <w:i w:val="0"/>
+          <w:sz w:val="21"/>
+        </w:rPr>
+        <w:t xml:space="preserve">Designed and implemented financial data flows using semantic data modeling. Built a governed analytics layer in </w:t>
+      </w:r>
+      <w:r>
+        <w:rPr>
+          <w:b/>
+          <w:i w:val="0"/>
+          <w:sz w:val="21"/>
+        </w:rPr>
+        <w:t>dbt</w:t>
+      </w:r>
+      <w:r>
+        <w:rPr>
+          <w:b w:val="0"/>
+          <w:i w:val="0"/>
+          <w:sz w:val="21"/>
+        </w:rPr>
+        <w:t xml:space="preserve"> on </w:t>
+      </w:r>
+      <w:r>
+        <w:rPr>
+          <w:b/>
+          <w:i w:val="0"/>
+          <w:sz w:val="21"/>
+        </w:rPr>
+        <w:t>Snowflake</w:t>
+      </w:r>
+      <w:r>
+        <w:rPr>
+          <w:b w:val="0"/>
+          <w:i w:val="0"/>
+          <w:sz w:val="21"/>
+        </w:rPr>
+        <w:t>, exposing trusted financial metrics through a semantic layer.</w:t>
+      </w:r>
     </w:p>
     <w:p>
       <w:pPr>
-        <w:spacing w:before="200" w:after="120"/>
+        <w:spacing w:before="0" w:after="80"/>
+      </w:pPr>
+      <w:r>
+        <w:rPr>
+          <w:b w:val="0"/>
+          <w:i w:val="0"/>
+          <w:sz w:val="21"/>
+        </w:rPr>
+        <w:t xml:space="preserve">Developed a custom </w:t>
+      </w:r>
+      <w:r>
+        <w:rPr>
+          <w:b/>
+          <w:i w:val="0"/>
+          <w:sz w:val="21"/>
+        </w:rPr>
+        <w:t>LangChain</w:t>
+      </w:r>
+      <w:r>
+        <w:rPr>
+          <w:b w:val="0"/>
+          <w:i w:val="0"/>
+          <w:sz w:val="21"/>
+        </w:rPr>
+        <w:t xml:space="preserve"> agent over a data ontology, presenting an OpenAI Chat-compatible interface. The agent was surfaced via </w:t>
+      </w:r>
+      <w:r>
+        <w:rPr>
+          <w:b/>
+          <w:i w:val="0"/>
+          <w:sz w:val="21"/>
+        </w:rPr>
+        <w:t>Azure Bot</w:t>
+      </w:r>
+      <w:r>
+        <w:rPr>
+          <w:b w:val="0"/>
+          <w:i w:val="0"/>
+          <w:sz w:val="21"/>
+        </w:rPr>
+        <w:t xml:space="preserve"> in MS Teams.</w:t>
+      </w:r>
+    </w:p>
+    <w:p>
+      <w:pPr>
+        <w:spacing w:before="0" w:after="80"/>
+      </w:pPr>
+      <w:r>
+        <w:rPr>
+          <w:b w:val="0"/>
+          <w:i w:val="0"/>
+          <w:sz w:val="21"/>
+        </w:rPr>
+        <w:t xml:space="preserve">To enable governed agent access to dbt data, built a custom </w:t>
+      </w:r>
+      <w:r>
+        <w:rPr>
+          <w:b/>
+          <w:i w:val="0"/>
+          <w:sz w:val="21"/>
+        </w:rPr>
+        <w:t>MCP server</w:t>
+      </w:r>
+      <w:r>
+        <w:rPr>
+          <w:b w:val="0"/>
+          <w:i w:val="0"/>
+          <w:sz w:val="21"/>
+        </w:rPr>
+        <w:t xml:space="preserve">. Applied </w:t>
+      </w:r>
+      <w:r>
+        <w:rPr>
+          <w:b/>
+          <w:i w:val="0"/>
+          <w:sz w:val="21"/>
+        </w:rPr>
+        <w:t>MLflow 3</w:t>
+      </w:r>
+      <w:r>
+        <w:rPr>
+          <w:b w:val="0"/>
+          <w:i w:val="0"/>
+          <w:sz w:val="21"/>
+        </w:rPr>
+        <w:t xml:space="preserve"> GenAI evaluation to systematically assess and improve response quality. Set up CI/CD on </w:t>
+      </w:r>
+      <w:r>
+        <w:rPr>
+          <w:b/>
+          <w:i w:val="0"/>
+          <w:sz w:val="21"/>
+        </w:rPr>
+        <w:t>Azure</w:t>
+      </w:r>
+      <w:r>
+        <w:rPr>
+          <w:b w:val="0"/>
+          <w:i w:val="0"/>
+          <w:sz w:val="21"/>
+        </w:rPr>
+        <w:t xml:space="preserve"> for end-to-end deployment.</w:t>
+      </w:r>
+    </w:p>
+    <w:p>
+      <w:pPr>
+        <w:spacing w:before="160" w:after="20"/>
       </w:pPr>
       <w:r>
         <w:rPr>
           <w:b/>
+          <w:i w:val="0"/>
           <w:color w:val="2C3F51"/>
-          <w:sz w:val="36"/>
+          <w:sz w:val="23"/>
         </w:rPr>
-        <w:t>Languages</w:t>
+        <w:t>Lead Developer</w:t>
+      </w:r>
+    </w:p>
+    <w:p>
+      <w:pPr>
+        <w:spacing w:before="0" w:after="40"/>
+      </w:pPr>
+      <w:r>
+        <w:rPr>
+          <w:b/>
+          <w:i/>
+          <w:sz w:val="20"/>
+        </w:rPr>
+        <w:t>T-Bank (Tinkoff)</w:t>
+      </w:r>
+      <w:r>
+        <w:rPr>
+          <w:b w:val="0"/>
+          <w:i/>
+          <w:sz w:val="20"/>
+        </w:rPr>
+        <w:t>, 2024 - 2026</w:t>
+      </w:r>
+    </w:p>
+    <w:p>
+      <w:pPr>
+        <w:spacing w:before="0" w:after="80"/>
+      </w:pPr>
+      <w:r>
+        <w:rPr>
+          <w:b w:val="0"/>
+          <w:i w:val="0"/>
+          <w:sz w:val="21"/>
+        </w:rPr>
+        <w:t>Led development across the Base Infrastructure, Platform Analytics, and Interface Reliability teams at TBank, building web analytics and infrastructure platforms for the whole SME, including the FrameManager orchestrator for 100+ micro frontends that controls their loading and acts as the source of truth for business data, while providing analytics tooling and monitoring web interface reliability.</w:t>
+      </w:r>
+    </w:p>
+    <w:p>
+      <w:pPr>
+        <w:spacing w:before="0" w:after="80"/>
+      </w:pPr>
+      <w:r>
+        <w:rPr>
+          <w:b w:val="0"/>
+          <w:i w:val="0"/>
+          <w:sz w:val="21"/>
+        </w:rPr>
+        <w:t xml:space="preserve">Managed the data and feature flags migration process during a bank acquisition, building ELT pipelines with </w:t>
+      </w:r>
+      <w:r>
+        <w:rPr>
+          <w:b/>
+          <w:i w:val="0"/>
+          <w:sz w:val="21"/>
+        </w:rPr>
+        <w:t>Python</w:t>
+      </w:r>
+      <w:r>
+        <w:rPr>
+          <w:b w:val="0"/>
+          <w:i w:val="0"/>
+          <w:sz w:val="21"/>
+        </w:rPr>
+        <w:t xml:space="preserve"> and Data Build Tool (</w:t>
+      </w:r>
+      <w:r>
+        <w:rPr>
+          <w:b/>
+          <w:i w:val="0"/>
+          <w:sz w:val="21"/>
+        </w:rPr>
+        <w:t>dbt</w:t>
+      </w:r>
+      <w:r>
+        <w:rPr>
+          <w:b w:val="0"/>
+          <w:i w:val="0"/>
+          <w:sz w:val="21"/>
+        </w:rPr>
+        <w:t>).</w:t>
+      </w:r>
+    </w:p>
+    <w:p>
+      <w:pPr>
+        <w:spacing w:before="160" w:after="20"/>
+      </w:pPr>
+      <w:r>
+        <w:rPr>
+          <w:b/>
+          <w:i w:val="0"/>
+          <w:color w:val="2C3F51"/>
+          <w:sz w:val="23"/>
+        </w:rPr>
+        <w:t>Senior Fullstack Developer</w:t>
+      </w:r>
+    </w:p>
+    <w:p>
+      <w:pPr>
+        <w:spacing w:before="0" w:after="40"/>
+      </w:pPr>
+      <w:r>
+        <w:rPr>
+          <w:b w:val="0"/>
+          <w:i/>
+          <w:sz w:val="20"/>
+        </w:rPr>
+        <w:t>RaboBank</w:t>
+      </w:r>
+      <w:r>
+        <w:rPr>
+          <w:b w:val="0"/>
+          <w:i/>
+          <w:sz w:val="20"/>
+        </w:rPr>
+        <w:t>, 2023 - 2024, Netherlands</w:t>
+      </w:r>
+    </w:p>
+    <w:p>
+      <w:pPr>
+        <w:spacing w:before="0" w:after="80"/>
+      </w:pPr>
+      <w:r>
+        <w:rPr>
+          <w:b w:val="0"/>
+          <w:i w:val="0"/>
+          <w:sz w:val="21"/>
+        </w:rPr>
+        <w:t>Joined the core team of the business banking application at RaboBank, a leading Dutch bank, providing continuous support to feature teams, acting as codeowner for all pull requests, monitoring and adjusting build pipelines, and facilitating monorepo integration.</w:t>
+      </w:r>
+    </w:p>
+    <w:p>
+      <w:pPr>
+        <w:spacing w:before="0" w:after="80"/>
+      </w:pPr>
+      <w:r>
+        <w:rPr>
+          <w:b w:val="0"/>
+          <w:i w:val="0"/>
+          <w:sz w:val="21"/>
+        </w:rPr>
+        <w:t xml:space="preserve">Led performance improvement and monitoring of the Business Banking App, contributed to 24/7 tech support, and drove a spike integrating code quality and web vitals metrics into </w:t>
+      </w:r>
+      <w:r>
+        <w:rPr>
+          <w:b/>
+          <w:i w:val="0"/>
+          <w:sz w:val="21"/>
+        </w:rPr>
+        <w:t>Snowflake</w:t>
+      </w:r>
+      <w:r>
+        <w:rPr>
+          <w:b w:val="0"/>
+          <w:i w:val="0"/>
+          <w:sz w:val="21"/>
+        </w:rPr>
+        <w:t xml:space="preserve"> via CI/CD pipelines, with aggregated data powering </w:t>
+      </w:r>
+      <w:r>
+        <w:rPr>
+          <w:b/>
+          <w:i w:val="0"/>
+          <w:sz w:val="21"/>
+        </w:rPr>
+        <w:t>Power BI</w:t>
+      </w:r>
+      <w:r>
+        <w:rPr>
+          <w:b w:val="0"/>
+          <w:i w:val="0"/>
+          <w:sz w:val="21"/>
+        </w:rPr>
+        <w:t xml:space="preserve"> reports for technical debt and scan analysis.</w:t>
+      </w:r>
+    </w:p>
+    <w:p>
+      <w:pPr>
+        <w:spacing w:before="160" w:after="20"/>
+      </w:pPr>
+      <w:r>
+        <w:rPr>
+          <w:b/>
+          <w:i w:val="0"/>
+          <w:color w:val="2C3F51"/>
+          <w:sz w:val="23"/>
+        </w:rPr>
+        <w:t>Tech Lead</w:t>
+      </w:r>
+    </w:p>
+    <w:p>
+      <w:pPr>
+        <w:spacing w:before="0" w:after="40"/>
+      </w:pPr>
+      <w:r>
+        <w:rPr>
+          <w:b/>
+          <w:i/>
+          <w:sz w:val="20"/>
+        </w:rPr>
+        <w:t>BrightCape</w:t>
+      </w:r>
+      <w:r>
+        <w:rPr>
+          <w:b w:val="0"/>
+          <w:i/>
+          <w:sz w:val="20"/>
+        </w:rPr>
+        <w:t>, 2019 - 2020, Netherlands</w:t>
+      </w:r>
+    </w:p>
+    <w:p>
+      <w:pPr>
+        <w:spacing w:before="0" w:after="80"/>
+      </w:pPr>
+      <w:r>
+        <w:rPr>
+          <w:b w:val="0"/>
+          <w:i w:val="0"/>
+          <w:sz w:val="21"/>
+        </w:rPr>
+        <w:t xml:space="preserve">I've joined </w:t>
+      </w:r>
+      <w:r>
+        <w:rPr>
+          <w:b w:val="0"/>
+          <w:i w:val="0"/>
+          <w:sz w:val="21"/>
+        </w:rPr>
+        <w:t>BrightCape</w:t>
+      </w:r>
+      <w:r>
+        <w:rPr>
+          <w:b w:val="0"/>
+          <w:i w:val="0"/>
+          <w:sz w:val="21"/>
+        </w:rPr>
+        <w:t xml:space="preserve"> as a front-end lead to adjust the development process for the ongoing project and improve the architecture. With the small team we work in </w:t>
+      </w:r>
+      <w:r>
+        <w:rPr>
+          <w:b/>
+          <w:i w:val="0"/>
+          <w:sz w:val="21"/>
+        </w:rPr>
+        <w:t>Angular</w:t>
+      </w:r>
+      <w:r>
+        <w:rPr>
+          <w:b w:val="0"/>
+          <w:i w:val="0"/>
+          <w:sz w:val="21"/>
+        </w:rPr>
+        <w:t xml:space="preserve"> stack on refactoring the management system for the </w:t>
+      </w:r>
+      <w:r>
+        <w:rPr>
+          <w:b w:val="0"/>
+          <w:i w:val="0"/>
+          <w:sz w:val="21"/>
+        </w:rPr>
+        <w:t>SARA Robotics Health Assistant</w:t>
+      </w:r>
+      <w:r>
+        <w:rPr>
+          <w:b w:val="0"/>
+          <w:i w:val="0"/>
+          <w:sz w:val="21"/>
+        </w:rPr>
+        <w:t xml:space="preserve"> and creating the hybrid application for the robot itself. My key responsibilities were maintaining the source quality and perform the knowledge transfer. In course of half a year we've managed to structure the project, create a custom </w:t>
+      </w:r>
+      <w:r>
+        <w:rPr>
+          <w:b/>
+          <w:i w:val="0"/>
+          <w:sz w:val="21"/>
+        </w:rPr>
+        <w:t>design system</w:t>
+      </w:r>
+      <w:r>
+        <w:rPr>
+          <w:b w:val="0"/>
+          <w:i w:val="0"/>
+          <w:sz w:val="21"/>
+        </w:rPr>
+        <w:t xml:space="preserve"> and halve the original bundle size.</w:t>
+      </w:r>
+    </w:p>
+    <w:p>
+      <w:pPr>
+        <w:spacing w:before="160" w:after="20"/>
+      </w:pPr>
+      <w:r>
+        <w:rPr>
+          <w:b/>
+          <w:i w:val="0"/>
+          <w:color w:val="2C3F51"/>
+          <w:sz w:val="23"/>
+        </w:rPr>
+        <w:t>Senior Fullstack Engineer</w:t>
+      </w:r>
+    </w:p>
+    <w:p>
+      <w:pPr>
+        <w:spacing w:before="0" w:after="40"/>
+      </w:pPr>
+      <w:r>
+        <w:rPr>
+          <w:b/>
+          <w:i/>
+          <w:sz w:val="20"/>
+        </w:rPr>
+        <w:t>Wolters Kluwer</w:t>
+      </w:r>
+      <w:r>
+        <w:rPr>
+          <w:b w:val="0"/>
+          <w:i/>
+          <w:sz w:val="20"/>
+        </w:rPr>
+        <w:t>, 2019, 2021 - 2023, The Hague, Netherlands</w:t>
+      </w:r>
+    </w:p>
+    <w:p>
+      <w:pPr>
+        <w:spacing w:before="0" w:after="80"/>
+      </w:pPr>
+      <w:r>
+        <w:rPr>
+          <w:b w:val="0"/>
+          <w:i w:val="0"/>
+          <w:sz w:val="21"/>
+        </w:rPr>
+        <w:t xml:space="preserve">Worked on enterprise-scale </w:t>
+      </w:r>
+      <w:r>
+        <w:rPr>
+          <w:b w:val="0"/>
+          <w:i w:val="0"/>
+          <w:sz w:val="21"/>
+        </w:rPr>
+        <w:t>permit-to-work and risk assessment software</w:t>
+      </w:r>
+      <w:r>
+        <w:rPr>
+          <w:b w:val="0"/>
+          <w:i w:val="0"/>
+          <w:sz w:val="21"/>
+        </w:rPr>
+        <w:t xml:space="preserve">, deepening </w:t>
+      </w:r>
+      <w:r>
+        <w:rPr>
+          <w:b/>
+          <w:i w:val="0"/>
+          <w:sz w:val="21"/>
+        </w:rPr>
+        <w:t>React</w:t>
+      </w:r>
+      <w:r>
+        <w:rPr>
+          <w:b w:val="0"/>
+          <w:i w:val="0"/>
+          <w:sz w:val="21"/>
+        </w:rPr>
+        <w:t xml:space="preserve"> expertise and coordinating across numerous teams with diverse knowledge levels, initiating the migration to </w:t>
+      </w:r>
+      <w:r>
+        <w:rPr>
+          <w:b/>
+          <w:i w:val="0"/>
+          <w:sz w:val="21"/>
+        </w:rPr>
+        <w:t>TypeScript</w:t>
+      </w:r>
+      <w:r>
+        <w:rPr>
+          <w:b w:val="0"/>
+          <w:i w:val="0"/>
+          <w:sz w:val="21"/>
+        </w:rPr>
+        <w:t xml:space="preserve"> and setting up the migration flow for a monolith application.</w:t>
+      </w:r>
+    </w:p>
+    <w:p>
+      <w:pPr>
+        <w:spacing w:before="0" w:after="80"/>
+      </w:pPr>
+      <w:r>
+        <w:rPr>
+          <w:b w:val="0"/>
+          <w:i w:val="0"/>
+          <w:sz w:val="21"/>
+        </w:rPr>
+        <w:t>Collaborated with .NET engineers in full-stack teams on AWS API integrations, leveraging API Gateway, S3, and Lambda for scalable backend services.</w:t>
+      </w:r>
+    </w:p>
+    <w:p>
+      <w:pPr>
+        <w:spacing w:before="160" w:after="20"/>
+      </w:pPr>
+      <w:r>
+        <w:rPr>
+          <w:b/>
+          <w:i w:val="0"/>
+          <w:color w:val="2C3F51"/>
+          <w:sz w:val="23"/>
+        </w:rPr>
+        <w:t>Senior Fullstack Developer</w:t>
+      </w:r>
+    </w:p>
+    <w:p>
+      <w:pPr>
+        <w:spacing w:before="0" w:after="40"/>
+      </w:pPr>
+      <w:r>
+        <w:rPr>
+          <w:b/>
+          <w:i/>
+          <w:sz w:val="20"/>
+        </w:rPr>
+        <w:t>Air France - KLM</w:t>
+      </w:r>
+      <w:r>
+        <w:rPr>
+          <w:b w:val="0"/>
+          <w:i/>
+          <w:sz w:val="20"/>
+        </w:rPr>
+        <w:t>, 2018 - 2019, Netherlands</w:t>
+      </w:r>
+    </w:p>
+    <w:p>
+      <w:pPr>
+        <w:spacing w:before="0" w:after="80"/>
+      </w:pPr>
+      <w:r>
+        <w:rPr>
+          <w:b w:val="0"/>
+          <w:i w:val="0"/>
+          <w:sz w:val="21"/>
+        </w:rPr>
+        <w:t xml:space="preserve">Contributed as a fullstack engineer to the </w:t>
+      </w:r>
+      <w:r>
+        <w:rPr>
+          <w:b w:val="0"/>
+          <w:i w:val="0"/>
+          <w:sz w:val="21"/>
+        </w:rPr>
+        <w:t>BlueWeb</w:t>
+      </w:r>
+      <w:r>
+        <w:rPr>
+          <w:b w:val="0"/>
+          <w:i w:val="0"/>
+          <w:sz w:val="21"/>
+        </w:rPr>
+        <w:t xml:space="preserve"> team developing the Air France-KLM main website, a large-scale multi-brand web application and one of the largest Angular implementations in the world, built in regular coordination with Google and Apollo teams.</w:t>
+      </w:r>
+    </w:p>
+    <w:p>
+      <w:pPr>
+        <w:spacing w:before="0" w:after="80"/>
+      </w:pPr>
+      <w:r>
+        <w:rPr>
+          <w:b w:val="0"/>
+          <w:i w:val="0"/>
+          <w:sz w:val="21"/>
+        </w:rPr>
+        <w:t>Implemented the passenger check-in flow on the web and applied full-stack expertise building the BFF server (</w:t>
+      </w:r>
+      <w:r>
+        <w:rPr>
+          <w:b/>
+          <w:i w:val="0"/>
+          <w:sz w:val="21"/>
+        </w:rPr>
+        <w:t>Angular, Apollo, Node.js, GraphQL</w:t>
+      </w:r>
+      <w:r>
+        <w:rPr>
+          <w:b w:val="0"/>
+          <w:i w:val="0"/>
+          <w:sz w:val="21"/>
+        </w:rPr>
+        <w:t>).</w:t>
+      </w:r>
+    </w:p>
+    <w:p>
+      <w:pPr>
+        <w:spacing w:before="160" w:after="20"/>
+      </w:pPr>
+      <w:r>
+        <w:rPr>
+          <w:b/>
+          <w:i w:val="0"/>
+          <w:color w:val="2C3F51"/>
+          <w:sz w:val="23"/>
+        </w:rPr>
+        <w:t>Fullstack Software Engineer</w:t>
+      </w:r>
+    </w:p>
+    <w:p>
+      <w:pPr>
+        <w:spacing w:before="0" w:after="40"/>
+      </w:pPr>
+      <w:r>
+        <w:rPr>
+          <w:b/>
+          <w:i/>
+          <w:sz w:val="20"/>
+        </w:rPr>
+        <w:t>EURAC Research</w:t>
+      </w:r>
+      <w:r>
+        <w:rPr>
+          <w:b w:val="0"/>
+          <w:i/>
+          <w:sz w:val="20"/>
+        </w:rPr>
+        <w:t>, 2013 - 2017, Bolzano, Italy</w:t>
+      </w:r>
+    </w:p>
+    <w:p>
+      <w:pPr>
+        <w:spacing w:before="0" w:after="80"/>
+      </w:pPr>
+      <w:r>
+        <w:rPr>
+          <w:b w:val="0"/>
+          <w:i w:val="0"/>
+          <w:sz w:val="21"/>
+        </w:rPr>
+        <w:t xml:space="preserve">Worked at the </w:t>
+      </w:r>
+      <w:r>
+        <w:rPr>
+          <w:b w:val="0"/>
+          <w:i w:val="0"/>
+          <w:sz w:val="21"/>
+        </w:rPr>
+        <w:t>European Academy of Research</w:t>
+      </w:r>
+      <w:r>
+        <w:rPr>
+          <w:b w:val="0"/>
+          <w:i w:val="0"/>
+          <w:sz w:val="21"/>
+        </w:rPr>
+        <w:t xml:space="preserve"> as an IT specialist, developing and maintaining solutions for managing internal resources and knowledge.</w:t>
       </w:r>
     </w:p>
     <w:p>
       <w:pPr>
         <w:pStyle w:val="ListBullet"/>
-        <w:spacing w:after="0"/>
+        <w:spacing w:before="0" w:after="80"/>
       </w:pPr>
       <w:r>
         <w:rPr>
-          <w:b/>
-          <w:color w:val="2C3F51"/>
+          <w:b w:val="0"/>
+          <w:i w:val="0"/>
+          <w:sz w:val="21"/>
         </w:rPr>
-        <w:t>Russian</w:t>
+        <w:t>Built internal services and REST APIs (</w:t>
       </w:r>
       <w:r>
         <w:rPr>
-          <w:color w:val="2C3F51"/>
+          <w:b w:val="0"/>
+          <w:i/>
+          <w:sz w:val="21"/>
         </w:rPr>
-        <w:t>: Native speaker</w:t>
+        <w:t>Java/Spring/Hibernate</w:t>
+      </w:r>
+      <w:r>
+        <w:rPr>
+          <w:b w:val="0"/>
+          <w:i w:val="0"/>
+          <w:sz w:val="21"/>
+        </w:rPr>
+        <w:t>) and a recommendation service (</w:t>
+      </w:r>
+      <w:r>
+        <w:rPr>
+          <w:b w:val="0"/>
+          <w:i/>
+          <w:sz w:val="21"/>
+        </w:rPr>
+        <w:t>Node.js</w:t>
+      </w:r>
+      <w:r>
+        <w:rPr>
+          <w:b w:val="0"/>
+          <w:i w:val="0"/>
+          <w:sz w:val="21"/>
+        </w:rPr>
+        <w:t>).</w:t>
       </w:r>
     </w:p>
     <w:p>
       <w:pPr>
         <w:pStyle w:val="ListBullet"/>
-        <w:spacing w:after="0"/>
+        <w:spacing w:before="0" w:after="80"/>
+      </w:pPr>
+      <w:r>
+        <w:rPr>
+          <w:b w:val="0"/>
+          <w:i w:val="0"/>
+          <w:sz w:val="21"/>
+        </w:rPr>
+        <w:t>Acted as Android developer and SCRUM master across several team mobile projects, from a local news application to a mobile e-learning platform (</w:t>
+      </w:r>
+      <w:r>
+        <w:rPr>
+          <w:b w:val="0"/>
+          <w:i/>
+          <w:sz w:val="21"/>
+        </w:rPr>
+        <w:t>Java/Android</w:t>
+      </w:r>
+      <w:r>
+        <w:rPr>
+          <w:b w:val="0"/>
+          <w:i w:val="0"/>
+          <w:sz w:val="21"/>
+        </w:rPr>
+        <w:t xml:space="preserve">), and prototyped mobile apps in </w:t>
+      </w:r>
+      <w:r>
+        <w:rPr>
+          <w:b w:val="0"/>
+          <w:i/>
+          <w:sz w:val="21"/>
+        </w:rPr>
+        <w:t>Ionic/Angular</w:t>
+      </w:r>
+      <w:r>
+        <w:rPr>
+          <w:b w:val="0"/>
+          <w:i w:val="0"/>
+          <w:sz w:val="21"/>
+        </w:rPr>
+        <w:t>.</w:t>
+      </w:r>
+    </w:p>
+    <w:p>
+      <w:pPr>
+        <w:spacing w:before="160" w:after="20"/>
       </w:pPr>
       <w:r>
         <w:rPr>
           <w:b/>
+          <w:i w:val="0"/>
           <w:color w:val="2C3F51"/>
+          <w:sz w:val="23"/>
         </w:rPr>
-        <w:t>English</w:t>
-      </w:r>
-      <w:r>
-        <w:rPr>
-          <w:color w:val="2C3F51"/>
-        </w:rPr>
-        <w:t>: Fluent speaking and writing (C1/2 university course)</w:t>
+        <w:t>Software Engineer</w:t>
       </w:r>
     </w:p>
     <w:p>
       <w:pPr>
-        <w:pStyle w:val="ListBullet"/>
-        <w:spacing w:after="0"/>
+        <w:spacing w:before="0" w:after="40"/>
       </w:pPr>
       <w:r>
         <w:rPr>
           <w:b/>
-          <w:color w:val="2C3F51"/>
+          <w:i/>
+          <w:sz w:val="20"/>
         </w:rPr>
-        <w:t>Italian</w:t>
+        <w:t>SmarDTV NAGRA Kudelski</w:t>
       </w:r>
       <w:r>
         <w:rPr>
-          <w:color w:val="2C3F51"/>
+          <w:b w:val="0"/>
+          <w:i/>
+          <w:sz w:val="20"/>
         </w:rPr>
-        <w:t>: Fluent speaking and writing (C1 CELI4 certificate)</w:t>
+        <w:t>, 2014, La Ciotat, France</w:t>
       </w:r>
     </w:p>
     <w:p>
       <w:pPr>
-        <w:pStyle w:val="ListBullet"/>
-        <w:spacing w:after="0"/>
+        <w:spacing w:before="0" w:after="80"/>
+      </w:pPr>
+      <w:r>
+        <w:rPr>
+          <w:b w:val="0"/>
+          <w:i w:val="0"/>
+          <w:sz w:val="21"/>
+        </w:rPr>
+        <w:t xml:space="preserve">Developed a hybrid iOS/Android application for the </w:t>
+      </w:r>
+      <w:r>
+        <w:rPr>
+          <w:b w:val="0"/>
+          <w:i w:val="0"/>
+          <w:sz w:val="21"/>
+        </w:rPr>
+        <w:t>Mediaset Smartcam</w:t>
+      </w:r>
+      <w:r>
+        <w:rPr>
+          <w:b w:val="0"/>
+          <w:i w:val="0"/>
+          <w:sz w:val="21"/>
+        </w:rPr>
+        <w:t xml:space="preserve"> project for a new-generation CI+ CAM device managing access to broadcast and on-demand Pay TV content.</w:t>
+      </w:r>
+    </w:p>
+    <w:p>
+      <w:pPr>
+        <w:spacing w:before="0" w:after="80"/>
+      </w:pPr>
+      <w:r>
+        <w:rPr>
+          <w:b w:val="0"/>
+          <w:i w:val="0"/>
+          <w:sz w:val="21"/>
+        </w:rPr>
+        <w:t>Built custom Cordova plugins for SmartCAM device integration and optimized Sencha Touch rendering performance.</w:t>
+      </w:r>
+    </w:p>
+    <w:p>
+      <w:pPr>
+        <w:spacing w:before="160" w:after="20"/>
       </w:pPr>
       <w:r>
         <w:rPr>
           <w:b/>
+          <w:i w:val="0"/>
           <w:color w:val="2C3F51"/>
+          <w:sz w:val="23"/>
         </w:rPr>
-        <w:t>German</w:t>
-      </w:r>
-      <w:r>
-        <w:rPr>
-          <w:color w:val="2C3F51"/>
-        </w:rPr>
-        <w:t>: Average communication proficiency (B1)</w:t>
+        <w:t>Consultant / Engineer / Tech Lead</w:t>
       </w:r>
     </w:p>
     <w:p>
       <w:pPr>
-        <w:pBdr>
-          <w:bottom w:val="single" w:sz="6" w:space="1" w:color="999999"/>
-        </w:pBdr>
-        <w:spacing w:after="40"/>
-      </w:pPr>
-    </w:p>
-    <w:p>
-      <w:pPr>
-        <w:spacing w:before="200" w:after="120"/>
+        <w:spacing w:before="0" w:after="40"/>
       </w:pPr>
       <w:r>
         <w:rPr>
           <w:b/>
-          <w:color w:val="2C3F51"/>
-          <w:sz w:val="36"/>
+          <w:i/>
+          <w:sz w:val="20"/>
         </w:rPr>
-        <w:t>Other skills and competences</w:t>
+        <w:t>SOLHEA Srl</w:t>
+      </w:r>
+      <w:r>
+        <w:rPr>
+          <w:b w:val="0"/>
+          <w:i/>
+          <w:sz w:val="20"/>
+        </w:rPr>
+        <w:t xml:space="preserve"> / Inquiria / EDP Progetti s.r.l</w:t>
+      </w:r>
+      <w:r>
+        <w:rPr>
+          <w:b w:val="0"/>
+          <w:i/>
+          <w:sz w:val="20"/>
+        </w:rPr>
+        <w:t>, 2013 - 2018, 2020 - 2023, Bolzano, Italy</w:t>
       </w:r>
     </w:p>
     <w:p>
       <w:pPr>
-        <w:pStyle w:val="ListBullet"/>
-        <w:spacing w:after="0"/>
+        <w:spacing w:before="0" w:after="80"/>
       </w:pPr>
       <w:r>
-        <w:t>Project management experience</w:t>
+        <w:rPr>
+          <w:b w:val="0"/>
+          <w:i w:val="0"/>
+          <w:sz w:val="21"/>
+        </w:rPr>
+        <w:t>Delivered full-stack medical and fintech applications end-to-end — from analysis and specification through client, API, and systems integration — as an on-demand consultant for Solhea Srl.</w:t>
       </w:r>
     </w:p>
     <w:p>
       <w:pPr>
-        <w:pStyle w:val="ListBullet"/>
-        <w:spacing w:after="0"/>
+        <w:spacing w:before="0" w:after="80"/>
       </w:pPr>
       <w:r>
-        <w:t>High adaptability, experience living abroad</w:t>
+        <w:rPr>
+          <w:b w:val="0"/>
+          <w:i w:val="0"/>
+          <w:sz w:val="21"/>
+        </w:rPr>
+        <w:t xml:space="preserve">Built </w:t>
+      </w:r>
+      <w:r>
+        <w:rPr>
+          <w:b w:val="0"/>
+          <w:i w:val="0"/>
+          <w:sz w:val="21"/>
+        </w:rPr>
+        <w:t>TiTengoInformato</w:t>
+      </w:r>
+      <w:r>
+        <w:rPr>
+          <w:b w:val="0"/>
+          <w:i w:val="0"/>
+          <w:sz w:val="21"/>
+        </w:rPr>
+        <w:t xml:space="preserve">, the first Italian app providing real-time connection between hospital emergency rooms and patients' families, implementing a patients' </w:t>
+      </w:r>
+      <w:r>
+        <w:rPr>
+          <w:b/>
+          <w:i w:val="0"/>
+          <w:sz w:val="21"/>
+        </w:rPr>
+        <w:t>PWA</w:t>
+      </w:r>
+      <w:r>
+        <w:rPr>
+          <w:b w:val="0"/>
+          <w:i w:val="0"/>
+          <w:sz w:val="21"/>
+        </w:rPr>
+        <w:t>, an admin app, and backend.</w:t>
       </w:r>
     </w:p>
     <w:p>
       <w:pPr>
-        <w:pStyle w:val="ListBullet"/>
-        <w:spacing w:after="0"/>
+        <w:spacing w:before="0" w:after="80"/>
       </w:pPr>
       <w:r>
-        <w:t>Easy learning, good communication skills</w:t>
+        <w:rPr>
+          <w:b w:val="0"/>
+          <w:i w:val="0"/>
+          <w:sz w:val="21"/>
+        </w:rPr>
+        <w:t xml:space="preserve">Designed and developed </w:t>
+      </w:r>
+      <w:r>
+        <w:rPr>
+          <w:b w:val="0"/>
+          <w:i w:val="0"/>
+          <w:sz w:val="21"/>
+        </w:rPr>
+        <w:t>TaoTouch</w:t>
+      </w:r>
+      <w:r>
+        <w:rPr>
+          <w:b w:val="0"/>
+          <w:i w:val="0"/>
+          <w:sz w:val="21"/>
+        </w:rPr>
+        <w:t>, a Roche Diagnostics pilot for remote anticoagulation treatment monitoring, including the iOS/Android app (</w:t>
+      </w:r>
+      <w:r>
+        <w:rPr>
+          <w:b/>
+          <w:i w:val="0"/>
+          <w:sz w:val="21"/>
+        </w:rPr>
+        <w:t>Ionic</w:t>
+      </w:r>
+      <w:r>
+        <w:rPr>
+          <w:b w:val="0"/>
+          <w:i w:val="0"/>
+          <w:sz w:val="21"/>
+        </w:rPr>
+        <w:t>), a REST service over an Oracle database (</w:t>
+      </w:r>
+      <w:r>
+        <w:rPr>
+          <w:b/>
+          <w:i w:val="0"/>
+          <w:sz w:val="21"/>
+        </w:rPr>
+        <w:t>Java/Spring/Hibernate</w:t>
+      </w:r>
+      <w:r>
+        <w:rPr>
+          <w:b w:val="0"/>
+          <w:i w:val="0"/>
+          <w:sz w:val="21"/>
+        </w:rPr>
+        <w:t xml:space="preserve">) — plus </w:t>
+      </w:r>
+      <w:r>
+        <w:rPr>
+          <w:b w:val="0"/>
+          <w:i w:val="0"/>
+          <w:sz w:val="21"/>
+        </w:rPr>
+        <w:t>EasyRec</w:t>
+      </w:r>
+      <w:r>
+        <w:rPr>
+          <w:b w:val="0"/>
+          <w:i w:val="0"/>
+          <w:sz w:val="21"/>
+        </w:rPr>
+        <w:t xml:space="preserve">, a mobile credit-collection solution (Ionic clients, </w:t>
+      </w:r>
+      <w:r>
+        <w:rPr>
+          <w:b/>
+          <w:i w:val="0"/>
+          <w:sz w:val="21"/>
+        </w:rPr>
+        <w:t>Node.js</w:t>
+      </w:r>
+      <w:r>
+        <w:rPr>
+          <w:b w:val="0"/>
+          <w:i w:val="0"/>
+          <w:sz w:val="21"/>
+        </w:rPr>
+        <w:t xml:space="preserve"> REST API) for Inquiria Investigations.</w:t>
       </w:r>
     </w:p>
     <w:p>
       <w:pPr>
-        <w:pStyle w:val="ListBullet"/>
-        <w:spacing w:after="0"/>
+        <w:spacing w:before="160" w:after="20"/>
       </w:pPr>
       <w:r>
-        <w:t>Passion for sport: boxing, free-diving, rock climbing</w:t>
+        <w:rPr>
+          <w:b/>
+          <w:i w:val="0"/>
+          <w:color w:val="2C3F51"/>
+          <w:sz w:val="23"/>
+        </w:rPr>
+        <w:t>Invited Lecturer</w:t>
       </w:r>
     </w:p>
     <w:p>
       <w:pPr>
-        <w:pStyle w:val="ListBullet"/>
-        <w:spacing w:after="0"/>
+        <w:spacing w:before="0" w:after="40"/>
       </w:pPr>
       <w:r>
-        <w:t>Balboa dancer and teacher (it's a swing dance)</w:t>
+        <w:rPr>
+          <w:b w:val="0"/>
+          <w:i/>
+          <w:sz w:val="20"/>
+        </w:rPr>
+        <w:t>CASE - Center for Applied Software Engineering</w:t>
+      </w:r>
+    </w:p>
+    <w:p>
+      <w:pPr>
+        <w:spacing w:before="0" w:after="40"/>
+      </w:pPr>
+      <w:r>
+        <w:rPr>
+          <w:b/>
+          <w:i/>
+          <w:sz w:val="20"/>
+        </w:rPr>
+        <w:t>General Staff of Italian Army</w:t>
+      </w:r>
+      <w:r>
+        <w:rPr>
+          <w:b w:val="0"/>
+          <w:i/>
+          <w:sz w:val="20"/>
+        </w:rPr>
+        <w:t>, 2012, Rome, Italy</w:t>
+      </w:r>
+    </w:p>
+    <w:p>
+      <w:pPr>
+        <w:spacing w:before="0" w:after="80"/>
+      </w:pPr>
+      <w:r>
+        <w:rPr>
+          <w:b w:val="0"/>
+          <w:i w:val="0"/>
+          <w:sz w:val="21"/>
+        </w:rPr>
+        <w:t>Delivered a lecture series on Web Development and the Spring Framework to the General Staff of the Italian Army (Stato Maggiore dell'Esercito) as part of my PhD assignment.</w:t>
+      </w:r>
+    </w:p>
+    <w:p>
+      <w:pPr>
+        <w:spacing w:before="160" w:after="20"/>
+      </w:pPr>
+      <w:r>
+        <w:rPr>
+          <w:b/>
+          <w:i w:val="0"/>
+          <w:color w:val="2C3F51"/>
+          <w:sz w:val="23"/>
+        </w:rPr>
+        <w:t>Co-founder at NexTrailer</w:t>
+      </w:r>
+    </w:p>
+    <w:p>
+      <w:pPr>
+        <w:spacing w:before="0" w:after="40"/>
+      </w:pPr>
+      <w:r>
+        <w:rPr>
+          <w:b/>
+          <w:i/>
+          <w:sz w:val="20"/>
+        </w:rPr>
+        <w:t>ISIS Software Incubator at Oxford University</w:t>
+      </w:r>
+      <w:r>
+        <w:rPr>
+          <w:b w:val="0"/>
+          <w:i/>
+          <w:sz w:val="20"/>
+        </w:rPr>
+        <w:t>, Oxford, UK, 2011 - 2014</w:t>
+      </w:r>
+    </w:p>
+    <w:p>
+      <w:pPr>
+        <w:spacing w:before="0" w:after="80"/>
+      </w:pPr>
+      <w:r>
+        <w:rPr>
+          <w:b w:val="0"/>
+          <w:i w:val="0"/>
+          <w:sz w:val="21"/>
+        </w:rPr>
+        <w:t>Co-founded NexTrailer, a movie-search startup based on movie trailers, where I led the UI features.</w:t>
+      </w:r>
+    </w:p>
+    <w:p>
+      <w:pPr>
+        <w:spacing w:before="160" w:after="20"/>
+      </w:pPr>
+      <w:r>
+        <w:rPr>
+          <w:b/>
+          <w:i w:val="0"/>
+          <w:color w:val="2C3F51"/>
+          <w:sz w:val="23"/>
+        </w:rPr>
+        <w:t>Data analyst and developer</w:t>
+      </w:r>
+    </w:p>
+    <w:p>
+      <w:pPr>
+        <w:spacing w:before="0" w:after="40"/>
+      </w:pPr>
+      <w:r>
+        <w:rPr>
+          <w:b/>
+          <w:i/>
+          <w:sz w:val="20"/>
+        </w:rPr>
+        <w:t>42matters AG</w:t>
+      </w:r>
+      <w:r>
+        <w:rPr>
+          <w:b w:val="0"/>
+          <w:i/>
+          <w:sz w:val="20"/>
+        </w:rPr>
+        <w:t>, 2011, Zürich, Switzerland</w:t>
+      </w:r>
+    </w:p>
+    <w:p>
+      <w:pPr>
+        <w:spacing w:before="0" w:after="80"/>
+      </w:pPr>
+      <w:r>
+        <w:rPr>
+          <w:b w:val="0"/>
+          <w:i w:val="0"/>
+          <w:sz w:val="21"/>
+        </w:rPr>
+        <w:t xml:space="preserve">Developed analysis and visualization tool for </w:t>
+      </w:r>
+      <w:r>
+        <w:rPr>
+          <w:b w:val="0"/>
+          <w:i w:val="0"/>
+          <w:sz w:val="21"/>
+        </w:rPr>
+        <w:t>Appaware</w:t>
+      </w:r>
+      <w:r>
+        <w:rPr>
+          <w:b w:val="0"/>
+          <w:i w:val="0"/>
+          <w:sz w:val="21"/>
+        </w:rPr>
+        <w:t xml:space="preserve"> Android Application Market using the </w:t>
+      </w:r>
+      <w:r>
+        <w:rPr>
+          <w:b/>
+          <w:i w:val="0"/>
+          <w:sz w:val="21"/>
+        </w:rPr>
+        <w:t>MongoDB</w:t>
+      </w:r>
+      <w:r>
+        <w:rPr>
+          <w:b w:val="0"/>
+          <w:i w:val="0"/>
+          <w:sz w:val="21"/>
+        </w:rPr>
+        <w:t xml:space="preserve"> aggregations.</w:t>
+      </w:r>
+    </w:p>
+    <w:p/>
+    <w:p>
+      <w:pPr>
+        <w:spacing w:before="0" w:after="80"/>
+      </w:pPr>
+      <w:r>
+        <w:rPr>
+          <w:b/>
+          <w:i w:val="0"/>
+          <w:color w:val="2C3F51"/>
+          <w:sz w:val="30"/>
+        </w:rPr>
+        <w:t>Education</w:t>
+      </w:r>
+    </w:p>
+    <w:p>
+      <w:pPr>
+        <w:spacing w:before="160" w:after="20"/>
+      </w:pPr>
+      <w:r>
+        <w:rPr>
+          <w:b/>
+          <w:i w:val="0"/>
+          <w:color w:val="2C3F51"/>
+          <w:sz w:val="23"/>
+        </w:rPr>
+        <w:t>Free University of Bolzano-Bozen, Italy</w:t>
+      </w:r>
+    </w:p>
+    <w:p>
+      <w:pPr>
+        <w:spacing w:before="0" w:after="40"/>
+      </w:pPr>
+      <w:r>
+        <w:rPr>
+          <w:b/>
+          <w:i/>
+          <w:sz w:val="20"/>
+        </w:rPr>
+        <w:t>PhD in Software Engineering</w:t>
+      </w:r>
+      <w:r>
+        <w:rPr>
+          <w:b w:val="0"/>
+          <w:i/>
+          <w:sz w:val="20"/>
+        </w:rPr>
+        <w:t>, 2012 - 2013</w:t>
+      </w:r>
+    </w:p>
+    <w:p>
+      <w:pPr>
+        <w:spacing w:before="0" w:after="40"/>
+      </w:pPr>
+      <w:r>
+        <w:rPr>
+          <w:b/>
+          <w:i/>
+          <w:sz w:val="20"/>
+        </w:rPr>
+        <w:t>Master in Computer Science (MSc)</w:t>
+      </w:r>
+      <w:r>
+        <w:rPr>
+          <w:b w:val="0"/>
+          <w:i/>
+          <w:sz w:val="20"/>
+        </w:rPr>
+        <w:t>, Center of Applied Software Engineering (CASE), 2007 - 2011</w:t>
+      </w:r>
+    </w:p>
+    <w:p>
+      <w:pPr>
+        <w:spacing w:before="160" w:after="20"/>
+      </w:pPr>
+      <w:r>
+        <w:rPr>
+          <w:b/>
+          <w:i w:val="0"/>
+          <w:color w:val="2C3F51"/>
+          <w:sz w:val="23"/>
+        </w:rPr>
+        <w:t>4 years BSc degree in Applied Mathematics</w:t>
+      </w:r>
+    </w:p>
+    <w:p>
+      <w:pPr>
+        <w:spacing w:before="0" w:after="40"/>
+      </w:pPr>
+      <w:r>
+        <w:rPr>
+          <w:b/>
+          <w:i/>
+          <w:sz w:val="20"/>
+        </w:rPr>
+        <w:t>State University of Novosibirsk (NSU)</w:t>
+      </w:r>
+      <w:r>
+        <w:rPr>
+          <w:b w:val="0"/>
+          <w:i/>
+          <w:sz w:val="20"/>
+        </w:rPr>
+        <w:t>, 2002 - 2006</w:t>
       </w:r>
     </w:p>
     <w:sectPr>
       <w:pgSz w:w="12240" w:h="15840"/>
-      <w:pgMar w:top="864" w:right="1008" w:bottom="864" w:left="1008" w:header="720" w:footer="720" w:gutter="0"/>
+      <w:pgMar w:top="1440" w:right="1800" w:bottom="1440" w:left="1800" w:header="720" w:footer="720" w:gutter="0"/>
       <w:cols w:space="720"/>
       <w:docGrid w:linePitch="360"/>
     </w:sectPr>
@@ -2793,12 +1849,8 @@
     <w:name w:val="Normal"/>
     <w:qFormat/>
     <w:rsid w:val="00FC693F"/>
-    <w:pPr>
-      <w:spacing w:after="0" w:line="336" w:lineRule="auto"/>
-    </w:pPr>
     <w:rPr>
       <w:rFonts w:ascii="Calibri" w:hAnsi="Calibri"/>
-      <w:color w:val="2C3F51"/>
       <w:sz w:val="21"/>
     </w:rPr>
   </w:style>

</xml_diff>

<commit_message>
Tighten BrightCape description into two concise paragraphs
Co-Authored-By: Claude Opus 4.8 (1M context) <noreply@anthropic.com>
</commit_message>
<xml_diff>
--- a/Evgeny_Tomsen_CV.docx
+++ b/Evgeny_Tomsen_CV.docx
@@ -485,7 +485,7 @@
           <w:i w:val="0"/>
           <w:sz w:val="21"/>
         </w:rPr>
-        <w:t xml:space="preserve">I've joined </w:t>
+        <w:t xml:space="preserve">Joined </w:t>
       </w:r>
       <w:r>
         <w:rPr>
@@ -501,7 +501,23 @@
           <w:i w:val="0"/>
           <w:sz w:val="21"/>
         </w:rPr>
-        <w:t xml:space="preserve"> as a front-end lead to adjust the development process for the ongoing project and improve the architecture. With the small team we work in </w:t>
+        <w:t xml:space="preserve"> as front-end lead to refine the development process and improve the architecture for the </w:t>
+      </w:r>
+      <w:r>
+        <w:rPr>
+          <w:b w:val="0"/>
+          <w:i w:val="0"/>
+          <w:sz w:val="21"/>
+        </w:rPr>
+        <w:t>SARA Robotics Health Assistant</w:t>
+      </w:r>
+      <w:r>
+        <w:rPr>
+          <w:b w:val="0"/>
+          <w:i w:val="0"/>
+          <w:sz w:val="21"/>
+        </w:rPr>
+        <w:t xml:space="preserve">, working in an </w:t>
       </w:r>
       <w:r>
         <w:rPr>
@@ -517,23 +533,20 @@
           <w:i w:val="0"/>
           <w:sz w:val="21"/>
         </w:rPr>
-        <w:t xml:space="preserve"> stack on refactoring the management system for the </w:t>
+        <w:t xml:space="preserve"> stack to refactor the management system and build the hybrid application for the robot itself.</w:t>
       </w:r>
+    </w:p>
+    <w:p>
+      <w:pPr>
+        <w:spacing w:before="0" w:after="80"/>
+      </w:pPr>
       <w:r>
         <w:rPr>
           <w:b w:val="0"/>
           <w:i w:val="0"/>
           <w:sz w:val="21"/>
         </w:rPr>
-        <w:t>SARA Robotics Health Assistant</w:t>
-      </w:r>
-      <w:r>
-        <w:rPr>
-          <w:b w:val="0"/>
-          <w:i w:val="0"/>
-          <w:sz w:val="21"/>
-        </w:rPr>
-        <w:t xml:space="preserve"> and creating the hybrid application for the robot itself. My key responsibilities were maintaining the source quality and perform the knowledge transfer. In course of half a year we've managed to structure the project, create a custom </w:t>
+        <w:t xml:space="preserve">Maintained source quality and led knowledge transfer, structuring the project, creating a custom </w:t>
       </w:r>
       <w:r>
         <w:rPr>
@@ -549,7 +562,7 @@
           <w:i w:val="0"/>
           <w:sz w:val="21"/>
         </w:rPr>
-        <w:t xml:space="preserve"> and halve the original bundle size.</w:t>
+        <w:t>, and halving the original bundle size.</w:t>
       </w:r>
     </w:p>
     <w:p>

</xml_diff>